<commit_message>
Fix reference alphabetical sorting and add missing re import
- Sort references by first author surname/institutional name so World Bank
  appears under W in Harvard alphabetical order.
- Import re at module level so the sort key can use it.
</commit_message>
<xml_diff>
--- a/Trade_Openness_Growth_Real.docx
+++ b/Trade_Openness_Growth_Real.docx
@@ -1423,23 +1423,6 @@
           <w:color w:val="000000"/>
           <w:sz w:val="24"/>
         </w:rPr>
-        <w:t>World Bank. (2024). World Development Indicators. World Bank. https://data.worldbank.org/</w:t>
-      </w:r>
-    </w:p>
-    <w:p>
-      <w:pPr>
-        <w:spacing w:line="480" w:lineRule="auto" w:after="0"/>
-        <w:ind w:left="720" w:hanging="720"/>
-        <w:jc w:val="left"/>
-      </w:pPr>
-      <w:r>
-        <w:rPr>
-          <w:rFonts w:ascii="Times New Roman" w:hAnsi="Times New Roman" w:eastAsia="Times New Roman"/>
-          <w:b w:val="0"/>
-          <w:i w:val="0"/>
-          <w:color w:val="000000"/>
-          <w:sz w:val="24"/>
-        </w:rPr>
         <w:t>Irwin, D. A., &amp; Tervio, M. (2002). Does trade raise income? Evidence from the twentieth century. Journal of International Economics, 58(1), 1–18. https://doi.org/10.1016/S0022-1996(01)00164-7</w:t>
       </w:r>
     </w:p>
@@ -1543,6 +1526,23 @@
           <w:sz w:val="24"/>
         </w:rPr>
         <w:t>Wacziarg, R., &amp; Welch, K. H. (2008). Trade liberalization and growth: New evidence. World Bank Economic Review, 22(2), 187–231. https://doi.org/10.1093/wber/lhn007</w:t>
+      </w:r>
+    </w:p>
+    <w:p>
+      <w:pPr>
+        <w:spacing w:line="480" w:lineRule="auto" w:after="0"/>
+        <w:ind w:left="720" w:hanging="720"/>
+        <w:jc w:val="left"/>
+      </w:pPr>
+      <w:r>
+        <w:rPr>
+          <w:rFonts w:ascii="Times New Roman" w:hAnsi="Times New Roman" w:eastAsia="Times New Roman"/>
+          <w:b w:val="0"/>
+          <w:i w:val="0"/>
+          <w:color w:val="000000"/>
+          <w:sz w:val="24"/>
+        </w:rPr>
+        <w:t>World Bank. (2024). World Development Indicators. World Bank. https://data.worldbank.org/</w:t>
       </w:r>
     </w:p>
     <w:p>

</xml_diff>

<commit_message>
Enforce double-blind anonymity and World Development title-page requirements
- Remove Acknowledgments, AI declaration, competing-interest, and data-availability
  sections from the anonymized manuscript; these now appear only on title_page.docx.
- Rewrite all first-person pronouns in the manuscript text to passive/third-person.
- Add real author info (Jinxin Li), affiliation, ORCID placeholder, running head,
  corresponding author, funding, declarations, and data availability to title page.
- Add continuous page numbers and line numbers to the manuscript.
- Apply double spacing to table cells and add World Bank WDI data-source notes to
  every table; simplify table notes.
- Maintain word count within 4500–10000 words (excluding references and tables).
</commit_message>
<xml_diff>
--- a/Trade_Openness_Growth_Real.docx
+++ b/Trade_Openness_Growth_Real.docx
@@ -51,7 +51,7 @@
           <w:color w:val="000000"/>
           <w:sz w:val="24"/>
         </w:rPr>
-        <w:t>This paper re-examines the trade openness-growth relationship using a transparent, reproducible panel of up to 183 economies from 2000 to 2022. We estimate pooled OLS, fixed-effects, time-effects, and two-way fixed-effects specifications and report Maddala-Wu Fisher panel unit-root tests, Engle-Granger residual cointegration tests, and subsample splits by development level, crisis period, and trade intensity. A 1% increase in the trade-to-GDP ratio is associated with a 0.0766% rise in GDP per capita under fixed effects (p = 0.0001), but the coefficient falls to -0.0456 (p = 0.0016) once country and year effects are included. Dynamic-panel and first-difference estimates remain positive, while subsample analysis indicates that the association is stronger among developed economies and before the 2008 financial crisis than afterward. The results suggest that the aggregate trade-to-GDP ratio captures several distinct economic forces and warn against treating broad liberalization as an automatic engine of growth.</w:t>
+        <w:t>This paper re-examines the trade openness-growth relationship using a transparent, reproducible panel of up to 183 economies from 2000 to 2022. It estimates pooled OLS, fixed-effects, time-effects, and two-way fixed-effects specifications and reports Maddala-Wu Fisher panel unit-root tests, Engle-Granger residual cointegration tests, and subsample splits by development level, crisis period, and trade intensity. A 1% increase in the trade-to-GDP ratio is associated with a 0.0766% rise in GDP per capita under fixed effects (p = 0.0001), but the coefficient falls to -0.0456 (p = 0.0016) once country and year effects are included. Dynamic-panel and first-difference estimates remain positive, while subsample analysis indicates that the association is stronger among developed economies and before the 2008 financial crisis than afterward. The results suggest that the aggregate trade-to-GDP ratio captures several distinct economic forces and warn against treating broad liberalization as an automatic engine of growth.</w:t>
       </w:r>
     </w:p>
     <w:p>
@@ -113,7 +113,7 @@
           <w:color w:val="000000"/>
           <w:sz w:val="24"/>
         </w:rPr>
-        <w:t>The empirical literature on trade and growth remains divided. While Frankel and Romer (1999) find a positive causal link using cross-sectional instruments, Rodriguez and Rodrik (2000) famously question the robustness of these findings, arguing that openness indicators often proxy for geography, institutions, and macroeconomic stability rather than trade policy itself. Using an updated panel of up to 183 economies from 2000 to 2022, we show that this division is not resolved by adding more data-it is driven almost entirely by the choice of estimator.</w:t>
+        <w:t>The empirical literature on trade and growth remains divided. While Frankel and Romer (1999) find a positive causal link using cross-sectional instruments, Rodriguez and Rodrik (2000) famously question the robustness of these findings, arguing that openness indicators often proxy for geography, institutions, and macroeconomic stability rather than trade policy itself. Using an updated panel of up to 183 economies from 2000 to 2022, the analysis shows that this division is not resolved by adding more data-it is driven almost entirely by the choice of estimator.</w:t>
       </w:r>
     </w:p>
     <w:p>
@@ -164,7 +164,7 @@
           <w:color w:val="000000"/>
           <w:sz w:val="24"/>
         </w:rPr>
-        <w:t>Recent work has moved toward sharper identification. Feyrer (2019) uses geography-driven variation in air-freight costs as an instrument; Billmeier and Nannicini (2013) evaluate liberalization episodes with synthetic controls; micro studies have traced the distributional consequences of import competition in specific labor markets (Autor et al., 2013; Pierce &amp; Schott, 2016; Fajgelbaum &amp; Khandelwal, 2016). These contributions share a common message: the aggregate correlation between trade and income is too fragile to support sweeping policy conclusions. Our paper takes that skepticism seriously and applies it to a standard macro panel. We do not claim to estimate a causal effect; instead, we document how sensitive the association is to modeling choices that are often treated as incidental.</w:t>
+        <w:t>Recent work has moved toward sharper identification. Feyrer (2019) uses geography-driven variation in air-freight costs as an instrument; Billmeier and Nannicini (2013) evaluate liberalization episodes with synthetic controls; micro studies have traced the distributional consequences of import competition in specific labor markets (Autor et al., 2013; Pierce &amp; Schott, 2016; Fajgelbaum &amp; Khandelwal, 2016). These contributions share a common message: the aggregate correlation between trade and income is too fragile to support sweeping policy conclusions. This paper takes that skepticism seriously and applies it to a standard macro panel. No causal effect is claimed; instead, the paper documents how sensitive the association is to modeling choices that are often treated as incidental.</w:t>
       </w:r>
     </w:p>
     <w:p>
@@ -181,7 +181,7 @@
           <w:color w:val="000000"/>
           <w:sz w:val="24"/>
         </w:rPr>
-        <w:t>We assemble an unbalanced panel of up to 183 economies from 2000 to 2022 using only the World Bank World Development Indicators API (World Bank, 2024). The analysis is deliberately transparent: pooled OLS, fixed effects, time effects, and two-way fixed effects are reported side by side, together with Maddala-Wu Fisher panel unit-root tests (Maddala &amp; Wu, 1999), Engle-Granger residual cointegration tests, subsample splits by development level and crisis period, and robustness checks that exclude small open economies, use lagged trade openness, and first-difference the data. Our aim is not to crown a preferred specification but to show how much the estimated trade-growth nexus moves-and to ask what that instability means for empirical research and for policy.</w:t>
+        <w:t>An unbalanced panel of up to 183 economies from 2000 to 2022 is assembled using only the World Bank World Development Indicators API (World Bank, 2024). The analysis is deliberately transparent: pooled OLS, fixed effects, time effects, and two-way fixed effects are reported side by side, together with Maddala-Wu Fisher panel unit-root tests (Maddala &amp; Wu, 1999), Engle-Granger residual cointegration tests, subsample splits by development level and crisis period, and robustness checks that exclude small open economies, use lagged trade openness, and first-difference the data. The aim is not to crown a preferred specification but to show how much the estimated trade-growth nexus moves-and to ask what that instability means for empirical research and for policy.</w:t>
       </w:r>
     </w:p>
     <w:p>
@@ -285,7 +285,7 @@
           <w:color w:val="000000"/>
           <w:sz w:val="24"/>
         </w:rPr>
-        <w:t>The sample covers the period 2000-2022. We drop World Bank regional and income aggregates, keep observations with positive values for GDP, trade, and investment so that logarithmic transformations are well defined, and drop a small number of extreme leverage observations in which trade exceeds 500% of GDP. These cases are mostly city-states and financial entrepots such as Hong Kong SAR, Singapore, and Luxembourg, where re-exports and financial-services trade inflate the merchandise trade measure far beyond domestic production. For example, Singapore's trade-to-GDP ratio exceeds 300% in every year of the sample, and Hong Kong's is consistently above 350%. Including them would make the pooled OLS estimate overwhelmingly a comparison between micro-states and continental economies rather than a meaningful openness-growth gradient.</w:t>
+        <w:t>The sample covers the period 2000-2022. Regional and income aggregates are dropped, and observations with positive values for GDP, trade, and investment are kept so that logarithmic transformations are well defined, and a small number of extreme leverage observations in which trade exceeds 500% of GDP are dropped. These cases are mostly city-states and financial entrepots such as Hong Kong SAR, Singapore, and Luxembourg, where re-exports and financial-services trade inflate the merchandise trade measure far beyond domestic production. For example, Singapore's trade-to-GDP ratio exceeds 300% in every year of the sample, and Hong Kong's is consistently above 350%. Including them would make the pooled OLS estimate overwhelmingly a comparison between micro-states and continental economies rather than a meaningful openness-growth gradient.</w:t>
       </w:r>
     </w:p>
     <w:p>
@@ -302,7 +302,7 @@
           <w:color w:val="000000"/>
           <w:sz w:val="24"/>
         </w:rPr>
-        <w:t>The resulting unbalanced panel contains 3,919 country-year observations for 183 economies. Data coverage is uneven: investment rates are missing for several fragile states in the early 2000s, and primary-school enrollment rates plateau near 100% for high-income countries, compressing the variation available for that regressor. We do not impute missing values; instead, the panel estimators use the country-years that are available for each specification. Summary statistics and the correlation matrix are reported in Tables 1 and 2.</w:t>
+        <w:t>The resulting unbalanced panel contains 3,919 country-year observations for 183 economies. Data coverage is uneven: investment rates are missing for several fragile states in the early 2000s, and primary-school enrollment rates plateau near 100% for high-income countries, compressing the variation available for that regressor. Missing values are not imputed; instead, the panel estimators use the country-years that are available for each specification. Summary statistics and the correlation matrix are reported in Tables 1 and 2.</w:t>
       </w:r>
     </w:p>
     <w:p>
@@ -354,7 +354,7 @@
           <w:color w:val="000000"/>
           <w:sz w:val="24"/>
         </w:rPr>
-        <w:t>We address this limitation in two ways. First, we control for investment, schooling, and population growth, which capture some of the channels through which openness might affect income. Second, we exclude the most extreme cases of re-export and financial entrepot activity, and we split the sample by development level and trade intensity to see whether the association is driven by a particular group of countries. Even so, our estimates should be read as conditional correlations rather than causal effects.</w:t>
+        <w:t>This limitation is addressed in two ways. First, the model controls for investment, schooling, and population growth, which capture some of the channels through which openness might affect income. Second, the most extreme cases of re-export and financial entrepot activity are excluded, and the sample is split by development level and trade intensity to see whether the association is driven by a particular group of countries. Even so, the estimates should be read as conditional correlations rather than causal effects.</w:t>
       </w:r>
     </w:p>
     <w:p>
@@ -389,7 +389,7 @@
           <w:color w:val="000000"/>
           <w:sz w:val="24"/>
         </w:rPr>
-        <w:t>We estimate four panel specifications. First, pooled OLS provides a baseline that reflects both between-country and within-country variation. Second, a fixed-effects (FE) estimator removes time-invariant country heterogeneity. Third, a time-effects (TE) estimator removes common shocks and trends. Fourth, a two-way fixed-effects (TWFE) estimator includes both country and year effects. The TWFE model is our most demanding specification because the coefficient on trade openness is identified only from deviations of a country's trade share from its own long-run mean and from the global year-specific mean.</w:t>
+        <w:t>Four panel specifications are estimated. First, pooled OLS provides a baseline that reflects both between-country and within-country variation. Second, a fixed-effects (FE) estimator removes time-invariant country heterogeneity. Third, a time-effects (TE) estimator removes common shocks and trends. Fourth, a two-way fixed-effects (TWFE) estimator includes both country and year effects. The TWFE model is the most demanding specification because the coefficient on trade openness is identified only from deviations of a country's trade share from its own long-run mean and from the global year-specific mean.</w:t>
       </w:r>
     </w:p>
     <w:p>
@@ -423,7 +423,7 @@
           <w:color w:val="000000"/>
           <w:sz w:val="24"/>
         </w:rPr>
-        <w:t>Because GDP per capita is highly persistent, we also estimate a dynamic panel that includes a lagged dependent variable. The lagged dependent variable partly controls for convergence dynamics and absorbs omitted slow-moving factors, but it is known to introduce bias in short panels; we therefore treat it as a robustness check rather than the preferred model (Nickell, 1981). Finally, we report first-differenced estimates, which remove country-specific levels and focus on short-run co-movement between changes in openness and changes in income.</w:t>
+        <w:t>Because GDP per capita is highly persistent, a dynamic panel that includes a lagged dependent variable is also estimated. The lagged dependent variable partly controls for convergence dynamics and absorbs omitted slow-moving factors, but it is known to introduce bias in short panels; it is therefore treated as a robustness check rather than the preferred model (Nickell, 1981). Finally, first-differenced estimates are reported, which remove country-specific levels and focus on short-run co-movement between changes in openness and changes in income.</w:t>
       </w:r>
     </w:p>
     <w:p>
@@ -458,7 +458,7 @@
           <w:color w:val="000000"/>
           <w:sz w:val="24"/>
         </w:rPr>
-        <w:t>When variables are persistent, pooled OLS and FE estimates may reflect spurious correlations rather than stable long-run relationships. We therefore report country-by-country augmented Dickey-Fuller (ADF) tests and Maddala-Wu Fisher combined p-value tests for the log-levels of GDP per capita, trade openness, and investment (Maddala &amp; Wu, 1999). We also report Engle-Granger two-step residual cointegration tests: for each country with sufficient data, we regress log GDP per capita on trade, investment, schooling, and population growth, and test whether the residuals are stationary. The combined Fisher p-value summarizes the panel evidence against the null of no cointegration.</w:t>
+        <w:t>When variables are persistent, pooled OLS and FE estimates may reflect spurious correlations rather than stable long-run relationships. Country-by-country augmented Dickey-Fuller (ADF) tests and Maddala-Wu Fisher combined p-value tests are therefore reported for the log-levels of GDP per capita, trade openness, and investment (Maddala &amp; Wu, 1999). Engle-Granger two-step residual cointegration tests are also reported: for each country with sufficient data, log GDP per capita is regressed on trade, investment, schooling, and population growth, and the residuals are tested for stationarity. The combined Fisher p-value summarizes the panel evidence against the null of no cointegration.</w:t>
       </w:r>
     </w:p>
     <w:p>
@@ -475,7 +475,7 @@
           <w:color w:val="000000"/>
           <w:sz w:val="24"/>
         </w:rPr>
-        <w:t>These tests are useful diagnostics, but they have limitations. ADF tests have low power in short panels, and the Maddala-Wu approach treats countries as independent units, which is unlikely to hold when countries are linked by common shocks and global business cycles. Cross-sectional dependence would require second-generation panel unit-root tests that are beyond the scope of this paper. We therefore interpret the pre-tests as descriptive evidence rather than as a definitive classification of the data-generating process.</w:t>
+        <w:t>These tests are useful diagnostics, but they have limitations. ADF tests have low power in short panels, and the Maddala-Wu approach treats countries as independent units, which is unlikely to hold when countries are linked by common shocks and global business cycles. Cross-sectional dependence would require second-generation panel unit-root tests that are beyond the scope of this paper. The pre-tests are therefore interpreted as descriptive evidence rather than as a definitive classification of the data-generating process.</w:t>
       </w:r>
     </w:p>
     <w:p>
@@ -510,7 +510,7 @@
           <w:color w:val="000000"/>
           <w:sz w:val="24"/>
         </w:rPr>
-        <w:t>The macro-level trade-growth relationship may mask important heterogeneity. We split the sample into developed and developing economies using OECD membership as a proxy, into pre-2008 and post-2008 periods to capture the global financial crisis, and into high- versus low-trade-intensity observations using the median trade-to-GDP ratio as a threshold. For each subsample we re-estimate the TWFE model and compare the trade-openness coefficient.</w:t>
+        <w:t>The macro-level trade-growth relationship may mask important heterogeneity. The sample is split into developed and developing economies using OECD membership as a proxy, into pre-2008 and post-2008 periods to capture the global financial crisis, and into high- versus low-trade-intensity observations using the median trade-to-GDP ratio as a threshold. For each subsample the TWFE model is re-estimated and the trade-openness coefficient is compared.</w:t>
       </w:r>
     </w:p>
     <w:p>
@@ -544,7 +544,7 @@
           <w:color w:val="000000"/>
           <w:sz w:val="24"/>
         </w:rPr>
-        <w:t>We deliberately keep the econometric approach simple. More sophisticated estimators such as system GMM, common-correlated effects mean-group, or panel cointegration methods have their place, but they require stronger assumptions and are harder to communicate to a policy audience. Our baseline specifications can be reproduced with any standard statistical package, which aligns with the journal's emphasis on transparent, evidence-based development research.</w:t>
+        <w:t>This study deliberately keeps the econometric approach simple. More sophisticated estimators such as system GMM, common-correlated effects mean-group, or panel cointegration methods have their place, but they require stronger assumptions and are harder to communicate to a policy audience. The baseline specifications can be reproduced with any standard statistical package, which aligns with the journal's emphasis on transparent, evidence-based development research.</w:t>
       </w:r>
     </w:p>
     <w:p>
@@ -561,7 +561,7 @@
           <w:color w:val="000000"/>
           <w:sz w:val="24"/>
         </w:rPr>
-        <w:t>The heterogeneity and robustness analyses are designed to probe the stability of the TWFE coefficient. We split the sample by OECD membership because developed economies have deeper financial markets, stronger contract enforcement, and more diversified production structures, all of which may raise the growth payoff from trade. The pre- and post-2008 split captures the global financial crisis and the subsequent slowdown in merchandise trade growth. The high- versus low-trade-intensity split checks whether the negative TWFE result is confined to small open economies with volatile trade shares.</w:t>
+        <w:t>The heterogeneity and robustness analyses are designed to probe the stability of the TWFE coefficient. The sample is split by OECD membership because developed economies have deeper financial markets, stronger contract enforcement, and more diversified production structures, all of which may raise the growth payoff from trade. The pre- and post-2008 split captures the global financial crisis and the subsequent slowdown in merchandise trade growth. The high- versus low-trade-intensity split checks whether the negative TWFE result is confined to small open economies with volatile trade shares.</w:t>
       </w:r>
     </w:p>
     <w:p>
@@ -614,7 +614,7 @@
           <w:color w:val="000000"/>
           <w:sz w:val="24"/>
         </w:rPr>
-        <w:t>The average country-year observation in the sample has a trade-to-GDP ratio of approximately 89.7% and a real GDP per capita of about $14,196. There is substantial cross-country heterogeneity: mean trade shares range from below 20% to above 400% for small open economies. Correlations show that log GDP per capita is positively correlated with log trade openness (r = 0.374) and negatively correlated with population growth (r = -0.260). Variance-inflation factors for the regressors are below conventional thresholds, with the exception of the constant, indicating that multicollinearity is not a major concern in our main specifications.</w:t>
+        <w:t>The average country-year observation in the sample has a trade-to-GDP ratio of approximately 89.7% and a real GDP per capita of about $14,196. There is substantial cross-country heterogeneity: mean trade shares range from below 20% to above 400% for small open economies. Correlations show that log GDP per capita is positively correlated with log trade openness (r = 0.374) and negatively correlated with population growth (r = -0.260). Variance-inflation factors for the regressors are below conventional thresholds, with the exception of the constant, indicating that multicollinearity is not a major concern in the main specifications.</w:t>
       </w:r>
     </w:p>
     <w:p>
@@ -683,7 +683,7 @@
           <w:color w:val="000000"/>
           <w:sz w:val="24"/>
         </w:rPr>
-        <w:t>The pre-tests matter for interpretation. If the series are non-stationary and not cointegrated, the pooled OLS and FE coefficients may reflect spurious correlation rather than a stable long-run relationship. The fact that cointegration is rejected in only a minority of countries reinforces our cautious reading of the static panel estimates.</w:t>
+        <w:t>The pre-tests matter for interpretation. If the series are non-stationary and not cointegrated, the pooled OLS and FE coefficients may reflect spurious correlation rather than a stable long-run relationship. The fact that cointegration is rejected in only a minority of countries reinforces a cautious reading of the static panel estimates.</w:t>
       </w:r>
     </w:p>
     <w:p>
@@ -942,7 +942,7 @@
           <w:color w:val="000000"/>
           <w:sz w:val="24"/>
         </w:rPr>
-        <w:t>Our findings line up with the broader literature in two respects. First, the strong cross-sectional correlation between trade openness and income levels is well documented (Frankel &amp; Romer, 1999; Sachs &amp; Warner, 1995; Irwin &amp; Tervio, 2002). Second, the sensitivity of this correlation to fixed effects is consistent with the critique that cross-country regressions may conflate trade with geography, institutions, and other development determinants (Rodriguez &amp; Rodrik, 2000; Edwards, 1998). The negative TWFE coefficient should not be read as trade reducing income; it indicates that, after removing country-specific means and common global trends, the residual year-to-year variation in trade shares is not positively associated with income levels.</w:t>
+        <w:t>The findings line up with the broader literature in two respects. First, the strong cross-sectional correlation between trade openness and income levels is well documented (Frankel &amp; Romer, 1999; Sachs &amp; Warner, 1995; Irwin &amp; Tervio, 2002). Second, the sensitivity of this correlation to fixed effects is consistent with the critique that cross-country regressions may conflate trade with geography, institutions, and other development determinants (Rodriguez &amp; Rodrik, 2000; Edwards, 1998). The negative TWFE coefficient should not be read as trade reducing income; it indicates that, after removing country-specific means and common global trends, the residual year-to-year variation in trade shares is not positively associated with income levels.</w:t>
       </w:r>
     </w:p>
     <w:p>
@@ -976,7 +976,7 @@
           <w:color w:val="000000"/>
           <w:sz w:val="24"/>
         </w:rPr>
-        <w:t>Several limitations are worth stating directly. Trade-to-GDP is a coarse measure of openness that mixes trade policy with geography, country size, and global commodity price movements (Rodriguez &amp; Rodrik, 2000). The annual frequency may be too high to capture the long-run growth effects emphasized by endogenous growth models. The Maddala-Wu and Engle-Granger tests treat each country as an independent unit and do not account for cross-sectional dependence; more sophisticated second-generation tests would be useful in a larger-country panel. We also lose some observations in the dynamic-panel and first-difference specifications, and the resulting samples are not identical to the static-panel sample. Most importantly, our estimates remain associative. Establishing causality would require instrumental variables tied to plausibly exogenous trade shocks, such as Feyrer's (2019) geography-based instrument or synthetic-control evaluations of liberalization episodes (Billmeier &amp; Nannicini, 2013), or difference-in-differences designs around preferential trade agreements. These approaches are beyond the scope of this exercise but are the natural next step for a journal submission.</w:t>
+        <w:t>Several limitations are worth stating directly. Trade-to-GDP is a coarse measure of openness that mixes trade policy with geography, country size, and global commodity price movements (Rodriguez &amp; Rodrik, 2000). The annual frequency may be too high to capture the long-run growth effects emphasized by endogenous growth models. The Maddala-Wu and Engle-Granger tests treat each country as an independent unit and do not account for cross-sectional dependence; more sophisticated second-generation tests would be useful in a larger-country panel. Some observations are also lost in the dynamic-panel and first-difference specifications, and the resulting samples are not identical to the static-panel sample. Most importantly, the estimates remain associative. Establishing causality would require instrumental variables tied to plausibly exogenous trade shocks, such as Feyrer's (2019) geography-based instrument or synthetic-control evaluations of liberalization episodes (Billmeier &amp; Nannicini, 2013), or difference-in-differences designs around preferential trade agreements. These approaches are beyond the scope of this exercise but are the natural next step for a journal submission.</w:t>
       </w:r>
     </w:p>
     <w:p>
@@ -1044,7 +1044,7 @@
           <w:color w:val="000000"/>
           <w:sz w:val="24"/>
         </w:rPr>
-        <w:t>This study also illustrates the value of reproducibility in development research. By downloading the data directly from the World Bank API, documenting every cleaning decision, and providing the analysis code in a public repository, we make it possible for other researchers to replicate the tables, test alternative specifications, and update the estimates as new data become available. Reproducibility does not guarantee correctness, but it makes errors easier to detect and debates easier to settle.</w:t>
+        <w:t>This study also illustrates the value of reproducibility in development research. Downloading the data directly from the World Bank API, documenting every cleaning decision, and providing the analysis code in a public repository makes it possible for other researchers to replicate the tables, test alternative specifications, and update the estimates as new data become available. Reproducibility does not guarantee correctness, but it makes errors easier to detect and debates easier to settle.</w:t>
       </w:r>
     </w:p>
     <w:p>
@@ -1079,7 +1079,7 @@
           <w:color w:val="000000"/>
           <w:sz w:val="24"/>
         </w:rPr>
-        <w:t>Our results suggest a simple diagnostic: if you want a positive trade-growth coefficient, run a pooled OLS or fixed-effects model; if you want a negative one, add year fixed effects. The TWFE estimate turns negative because the global upward trend in both trade and income during 2000-2022 is removed, leaving a within-year, within-country residual in which faster trade growth is not associated with faster income growth. This sensitivity implies that the aggregate trade-to-GDP ratio is picking up global cycles and country-size effects, not a structural policy parameter.</w:t>
+        <w:t>The results suggest a simple diagnostic: if you want a positive trade-growth coefficient, run a pooled OLS or fixed-effects model; if you want a negative one, add year fixed effects. The TWFE estimate turns negative because the global upward trend in both trade and income during 2000-2022 is removed, leaving a within-year, within-country residual in which faster trade growth is not associated with faster income growth. This sensitivity implies that the aggregate trade-to-GDP ratio is picking up global cycles and country-size effects, not a structural policy parameter.</w:t>
       </w:r>
     </w:p>
     <w:p>
@@ -1147,31 +1147,13 @@
           <w:color w:val="000000"/>
           <w:sz w:val="24"/>
         </w:rPr>
-        <w:t>World Development's readership spans economists, political scientists, and development practitioners. For this audience, the key takeaway is not whether trade is good or bad in the abstract, but under what conditions openness translates into broad-based growth. Our evidence suggests that those conditions are neither universal nor automatic.</w:t>
-      </w:r>
-    </w:p>
-    <w:p>
-      <w:pPr>
-        <w:pStyle w:val="Heading1"/>
-        <w:spacing w:before="360" w:after="120" w:line="480" w:lineRule="auto"/>
-        <w:ind w:firstLine="0"/>
-        <w:jc w:val="left"/>
-      </w:pPr>
-      <w:r>
-        <w:rPr>
-          <w:rFonts w:ascii="Times New Roman" w:hAnsi="Times New Roman" w:eastAsia="Times New Roman"/>
-          <w:b/>
-          <w:i w:val="0"/>
-          <w:color w:val="000000"/>
-          <w:sz w:val="28"/>
-        </w:rPr>
-        <w:t>Declaration of competing interest</w:t>
+        <w:t>World Development's readership spans economists, political scientists, and development practitioners. For this audience, the key takeaway is not whether trade is good or bad in the abstract, but under what conditions openness translates into broad-based growth. The evidence suggests that those conditions are neither universal nor automatic.</w:t>
       </w:r>
     </w:p>
     <w:p>
       <w:pPr>
         <w:spacing w:before="0" w:after="0" w:line="480" w:lineRule="auto"/>
-        <w:ind w:firstLine="0"/>
+        <w:ind w:firstLine="720"/>
         <w:jc w:val="both"/>
       </w:pPr>
       <w:r>
@@ -1182,77 +1164,7 @@
           <w:color w:val="000000"/>
           <w:sz w:val="24"/>
         </w:rPr>
-        <w:t>Declarations of interest: none</w:t>
-      </w:r>
-    </w:p>
-    <w:p>
-      <w:pPr>
-        <w:pStyle w:val="Heading1"/>
-        <w:spacing w:before="360" w:after="120" w:line="480" w:lineRule="auto"/>
-        <w:ind w:firstLine="0"/>
-        <w:jc w:val="left"/>
-      </w:pPr>
-      <w:r>
-        <w:rPr>
-          <w:rFonts w:ascii="Times New Roman" w:hAnsi="Times New Roman" w:eastAsia="Times New Roman"/>
-          <w:b/>
-          <w:i w:val="0"/>
-          <w:color w:val="000000"/>
-          <w:sz w:val="28"/>
-        </w:rPr>
-        <w:t>Declaration of generative AI and AI-assisted technologies in the manuscript preparation process</w:t>
-      </w:r>
-    </w:p>
-    <w:p>
-      <w:pPr>
-        <w:spacing w:before="0" w:after="0" w:line="480" w:lineRule="auto"/>
-        <w:ind w:firstLine="0"/>
-        <w:jc w:val="both"/>
-      </w:pPr>
-      <w:r>
-        <w:rPr>
-          <w:rFonts w:ascii="Times New Roman" w:hAnsi="Times New Roman" w:eastAsia="Times New Roman"/>
-          <w:b w:val="0"/>
-          <w:i w:val="0"/>
-          <w:color w:val="000000"/>
-          <w:sz w:val="24"/>
-        </w:rPr>
-        <w:t>During the preparation of this work the author(s) used GLM-5.2 for grammatical correction and linguistic refinement. After using this tool/service, the author(s) reviewed and edited the content as needed and take(s) full responsibility for the publication's content.</w:t>
-      </w:r>
-    </w:p>
-    <w:p>
-      <w:pPr>
-        <w:pStyle w:val="Heading1"/>
-        <w:spacing w:before="360" w:after="120" w:line="480" w:lineRule="auto"/>
-        <w:ind w:firstLine="0"/>
-        <w:jc w:val="left"/>
-      </w:pPr>
-      <w:r>
-        <w:rPr>
-          <w:rFonts w:ascii="Times New Roman" w:hAnsi="Times New Roman" w:eastAsia="Times New Roman"/>
-          <w:b/>
-          <w:i w:val="0"/>
-          <w:color w:val="000000"/>
-          <w:sz w:val="28"/>
-        </w:rPr>
-        <w:t>Data availability</w:t>
-      </w:r>
-    </w:p>
-    <w:p>
-      <w:pPr>
-        <w:spacing w:before="0" w:after="0" w:line="480" w:lineRule="auto"/>
-        <w:ind w:firstLine="0"/>
-        <w:jc w:val="both"/>
-      </w:pPr>
-      <w:r>
-        <w:rPr>
-          <w:rFonts w:ascii="Times New Roman" w:hAnsi="Times New Roman" w:eastAsia="Times New Roman"/>
-          <w:b w:val="0"/>
-          <w:i w:val="0"/>
-          <w:color w:val="000000"/>
-          <w:sz w:val="24"/>
-        </w:rPr>
-        <w:t>All data were downloaded from the World Bank World Development Indicators API (https://data.worldbank.org/) on the date of analysis. The Python scripts used to download, clean, analyze, and compile the manuscript are available at https://github.com/AcerisSolaIAS/trade-openness-growth-replication.</w:t>
+        <w:t>In summary, the contribution of this study is threefold. It provides a fully reproducible macro-panel benchmark using only public World Bank data; it documents how sensitive the estimated trade-growth elasticity is to estimator choice, sample period, and country group; and it shows that the aggregate trade-to-GDP ratio is too coarse a measure to guide country-specific liberalization strategies without complementary evidence on institutions, export structure, and absorptive capacity. These findings underscore the importance of context-specific evidence in formulating trade and development policy.</w:t>
       </w:r>
     </w:p>
     <w:p>
@@ -1614,7 +1526,7 @@
           </w:tcPr>
           <w:p>
             <w:pPr>
-              <w:spacing w:before="0" w:after="0" w:line="276" w:lineRule="auto"/>
+              <w:spacing w:before="0" w:after="0" w:line="480" w:lineRule="auto"/>
               <w:ind w:firstLine="0"/>
               <w:jc w:val="center"/>
             </w:pPr>
@@ -1645,7 +1557,7 @@
           </w:tcPr>
           <w:p>
             <w:pPr>
-              <w:spacing w:before="0" w:after="0" w:line="276" w:lineRule="auto"/>
+              <w:spacing w:before="0" w:after="0" w:line="480" w:lineRule="auto"/>
               <w:ind w:firstLine="0"/>
               <w:jc w:val="center"/>
             </w:pPr>
@@ -1676,7 +1588,7 @@
           </w:tcPr>
           <w:p>
             <w:pPr>
-              <w:spacing w:before="0" w:after="0" w:line="276" w:lineRule="auto"/>
+              <w:spacing w:before="0" w:after="0" w:line="480" w:lineRule="auto"/>
               <w:ind w:firstLine="0"/>
               <w:jc w:val="center"/>
             </w:pPr>
@@ -1707,7 +1619,7 @@
           </w:tcPr>
           <w:p>
             <w:pPr>
-              <w:spacing w:before="0" w:after="0" w:line="276" w:lineRule="auto"/>
+              <w:spacing w:before="0" w:after="0" w:line="480" w:lineRule="auto"/>
               <w:ind w:firstLine="0"/>
               <w:jc w:val="center"/>
             </w:pPr>
@@ -1738,7 +1650,7 @@
           </w:tcPr>
           <w:p>
             <w:pPr>
-              <w:spacing w:before="0" w:after="0" w:line="276" w:lineRule="auto"/>
+              <w:spacing w:before="0" w:after="0" w:line="480" w:lineRule="auto"/>
               <w:ind w:firstLine="0"/>
               <w:jc w:val="center"/>
             </w:pPr>
@@ -1771,7 +1683,7 @@
           </w:tcPr>
           <w:p>
             <w:pPr>
-              <w:spacing w:before="0" w:after="0" w:line="276" w:lineRule="auto"/>
+              <w:spacing w:before="0" w:after="0" w:line="480" w:lineRule="auto"/>
               <w:ind w:firstLine="0"/>
               <w:jc w:val="center"/>
             </w:pPr>
@@ -1802,7 +1714,7 @@
           </w:tcPr>
           <w:p>
             <w:pPr>
-              <w:spacing w:before="0" w:after="0" w:line="276" w:lineRule="auto"/>
+              <w:spacing w:before="0" w:after="0" w:line="480" w:lineRule="auto"/>
               <w:ind w:firstLine="0"/>
               <w:jc w:val="center"/>
             </w:pPr>
@@ -1833,7 +1745,7 @@
           </w:tcPr>
           <w:p>
             <w:pPr>
-              <w:spacing w:before="0" w:after="0" w:line="276" w:lineRule="auto"/>
+              <w:spacing w:before="0" w:after="0" w:line="480" w:lineRule="auto"/>
               <w:ind w:firstLine="0"/>
               <w:jc w:val="center"/>
             </w:pPr>
@@ -1864,7 +1776,7 @@
           </w:tcPr>
           <w:p>
             <w:pPr>
-              <w:spacing w:before="0" w:after="0" w:line="276" w:lineRule="auto"/>
+              <w:spacing w:before="0" w:after="0" w:line="480" w:lineRule="auto"/>
               <w:ind w:firstLine="0"/>
               <w:jc w:val="center"/>
             </w:pPr>
@@ -1895,7 +1807,7 @@
           </w:tcPr>
           <w:p>
             <w:pPr>
-              <w:spacing w:before="0" w:after="0" w:line="276" w:lineRule="auto"/>
+              <w:spacing w:before="0" w:after="0" w:line="480" w:lineRule="auto"/>
               <w:ind w:firstLine="0"/>
               <w:jc w:val="center"/>
             </w:pPr>
@@ -1928,7 +1840,7 @@
           </w:tcPr>
           <w:p>
             <w:pPr>
-              <w:spacing w:before="0" w:after="0" w:line="276" w:lineRule="auto"/>
+              <w:spacing w:before="0" w:after="0" w:line="480" w:lineRule="auto"/>
               <w:ind w:firstLine="0"/>
               <w:jc w:val="center"/>
             </w:pPr>
@@ -1959,7 +1871,7 @@
           </w:tcPr>
           <w:p>
             <w:pPr>
-              <w:spacing w:before="0" w:after="0" w:line="276" w:lineRule="auto"/>
+              <w:spacing w:before="0" w:after="0" w:line="480" w:lineRule="auto"/>
               <w:ind w:firstLine="0"/>
               <w:jc w:val="center"/>
             </w:pPr>
@@ -1990,7 +1902,7 @@
           </w:tcPr>
           <w:p>
             <w:pPr>
-              <w:spacing w:before="0" w:after="0" w:line="276" w:lineRule="auto"/>
+              <w:spacing w:before="0" w:after="0" w:line="480" w:lineRule="auto"/>
               <w:ind w:firstLine="0"/>
               <w:jc w:val="center"/>
             </w:pPr>
@@ -2021,7 +1933,7 @@
           </w:tcPr>
           <w:p>
             <w:pPr>
-              <w:spacing w:before="0" w:after="0" w:line="276" w:lineRule="auto"/>
+              <w:spacing w:before="0" w:after="0" w:line="480" w:lineRule="auto"/>
               <w:ind w:firstLine="0"/>
               <w:jc w:val="center"/>
             </w:pPr>
@@ -2052,7 +1964,7 @@
           </w:tcPr>
           <w:p>
             <w:pPr>
-              <w:spacing w:before="0" w:after="0" w:line="276" w:lineRule="auto"/>
+              <w:spacing w:before="0" w:after="0" w:line="480" w:lineRule="auto"/>
               <w:ind w:firstLine="0"/>
               <w:jc w:val="center"/>
             </w:pPr>
@@ -2085,7 +1997,7 @@
           </w:tcPr>
           <w:p>
             <w:pPr>
-              <w:spacing w:before="0" w:after="0" w:line="276" w:lineRule="auto"/>
+              <w:spacing w:before="0" w:after="0" w:line="480" w:lineRule="auto"/>
               <w:ind w:firstLine="0"/>
               <w:jc w:val="center"/>
             </w:pPr>
@@ -2116,7 +2028,7 @@
           </w:tcPr>
           <w:p>
             <w:pPr>
-              <w:spacing w:before="0" w:after="0" w:line="276" w:lineRule="auto"/>
+              <w:spacing w:before="0" w:after="0" w:line="480" w:lineRule="auto"/>
               <w:ind w:firstLine="0"/>
               <w:jc w:val="center"/>
             </w:pPr>
@@ -2147,7 +2059,7 @@
           </w:tcPr>
           <w:p>
             <w:pPr>
-              <w:spacing w:before="0" w:after="0" w:line="276" w:lineRule="auto"/>
+              <w:spacing w:before="0" w:after="0" w:line="480" w:lineRule="auto"/>
               <w:ind w:firstLine="0"/>
               <w:jc w:val="center"/>
             </w:pPr>
@@ -2178,7 +2090,7 @@
           </w:tcPr>
           <w:p>
             <w:pPr>
-              <w:spacing w:before="0" w:after="0" w:line="276" w:lineRule="auto"/>
+              <w:spacing w:before="0" w:after="0" w:line="480" w:lineRule="auto"/>
               <w:ind w:firstLine="0"/>
               <w:jc w:val="center"/>
             </w:pPr>
@@ -2209,7 +2121,7 @@
           </w:tcPr>
           <w:p>
             <w:pPr>
-              <w:spacing w:before="0" w:after="0" w:line="276" w:lineRule="auto"/>
+              <w:spacing w:before="0" w:after="0" w:line="480" w:lineRule="auto"/>
               <w:ind w:firstLine="0"/>
               <w:jc w:val="center"/>
             </w:pPr>
@@ -2242,7 +2154,7 @@
           </w:tcPr>
           <w:p>
             <w:pPr>
-              <w:spacing w:before="0" w:after="0" w:line="276" w:lineRule="auto"/>
+              <w:spacing w:before="0" w:after="0" w:line="480" w:lineRule="auto"/>
               <w:ind w:firstLine="0"/>
               <w:jc w:val="center"/>
             </w:pPr>
@@ -2273,7 +2185,7 @@
           </w:tcPr>
           <w:p>
             <w:pPr>
-              <w:spacing w:before="0" w:after="0" w:line="276" w:lineRule="auto"/>
+              <w:spacing w:before="0" w:after="0" w:line="480" w:lineRule="auto"/>
               <w:ind w:firstLine="0"/>
               <w:jc w:val="center"/>
             </w:pPr>
@@ -2304,7 +2216,7 @@
           </w:tcPr>
           <w:p>
             <w:pPr>
-              <w:spacing w:before="0" w:after="0" w:line="276" w:lineRule="auto"/>
+              <w:spacing w:before="0" w:after="0" w:line="480" w:lineRule="auto"/>
               <w:ind w:firstLine="0"/>
               <w:jc w:val="center"/>
             </w:pPr>
@@ -2335,7 +2247,7 @@
           </w:tcPr>
           <w:p>
             <w:pPr>
-              <w:spacing w:before="0" w:after="0" w:line="276" w:lineRule="auto"/>
+              <w:spacing w:before="0" w:after="0" w:line="480" w:lineRule="auto"/>
               <w:ind w:firstLine="0"/>
               <w:jc w:val="center"/>
             </w:pPr>
@@ -2366,7 +2278,7 @@
           </w:tcPr>
           <w:p>
             <w:pPr>
-              <w:spacing w:before="0" w:after="0" w:line="276" w:lineRule="auto"/>
+              <w:spacing w:before="0" w:after="0" w:line="480" w:lineRule="auto"/>
               <w:ind w:firstLine="0"/>
               <w:jc w:val="center"/>
             </w:pPr>
@@ -2399,7 +2311,7 @@
           </w:tcPr>
           <w:p>
             <w:pPr>
-              <w:spacing w:before="0" w:after="0" w:line="276" w:lineRule="auto"/>
+              <w:spacing w:before="0" w:after="0" w:line="480" w:lineRule="auto"/>
               <w:ind w:firstLine="0"/>
               <w:jc w:val="center"/>
             </w:pPr>
@@ -2430,7 +2342,7 @@
           </w:tcPr>
           <w:p>
             <w:pPr>
-              <w:spacing w:before="0" w:after="0" w:line="276" w:lineRule="auto"/>
+              <w:spacing w:before="0" w:after="0" w:line="480" w:lineRule="auto"/>
               <w:ind w:firstLine="0"/>
               <w:jc w:val="center"/>
             </w:pPr>
@@ -2461,7 +2373,7 @@
           </w:tcPr>
           <w:p>
             <w:pPr>
-              <w:spacing w:before="0" w:after="0" w:line="276" w:lineRule="auto"/>
+              <w:spacing w:before="0" w:after="0" w:line="480" w:lineRule="auto"/>
               <w:ind w:firstLine="0"/>
               <w:jc w:val="center"/>
             </w:pPr>
@@ -2492,7 +2404,7 @@
           </w:tcPr>
           <w:p>
             <w:pPr>
-              <w:spacing w:before="0" w:after="0" w:line="276" w:lineRule="auto"/>
+              <w:spacing w:before="0" w:after="0" w:line="480" w:lineRule="auto"/>
               <w:ind w:firstLine="0"/>
               <w:jc w:val="center"/>
             </w:pPr>
@@ -2523,7 +2435,7 @@
           </w:tcPr>
           <w:p>
             <w:pPr>
-              <w:spacing w:before="0" w:after="0" w:line="276" w:lineRule="auto"/>
+              <w:spacing w:before="0" w:after="0" w:line="480" w:lineRule="auto"/>
               <w:ind w:firstLine="0"/>
               <w:jc w:val="center"/>
             </w:pPr>
@@ -2555,7 +2467,7 @@
           <w:color w:val="000000"/>
           <w:sz w:val="22"/>
         </w:rPr>
-        <w:t>Note: Mean values by variable across countries.</w:t>
+        <w:t>Note: Mean values by variable across countries. Data source: World Bank World Development Indicators (2024).</w:t>
       </w:r>
     </w:p>
     <w:p>
@@ -2605,7 +2517,7 @@
           </w:tcPr>
           <w:p>
             <w:pPr>
-              <w:spacing w:before="0" w:after="0" w:line="276" w:lineRule="auto"/>
+              <w:spacing w:before="0" w:after="0" w:line="480" w:lineRule="auto"/>
               <w:ind w:firstLine="0"/>
               <w:jc w:val="center"/>
             </w:pPr>
@@ -2635,7 +2547,7 @@
           </w:tcPr>
           <w:p>
             <w:pPr>
-              <w:spacing w:before="0" w:after="0" w:line="276" w:lineRule="auto"/>
+              <w:spacing w:before="0" w:after="0" w:line="480" w:lineRule="auto"/>
               <w:ind w:firstLine="0"/>
               <w:jc w:val="center"/>
             </w:pPr>
@@ -2666,7 +2578,7 @@
           </w:tcPr>
           <w:p>
             <w:pPr>
-              <w:spacing w:before="0" w:after="0" w:line="276" w:lineRule="auto"/>
+              <w:spacing w:before="0" w:after="0" w:line="480" w:lineRule="auto"/>
               <w:ind w:firstLine="0"/>
               <w:jc w:val="center"/>
             </w:pPr>
@@ -2697,7 +2609,7 @@
           </w:tcPr>
           <w:p>
             <w:pPr>
-              <w:spacing w:before="0" w:after="0" w:line="276" w:lineRule="auto"/>
+              <w:spacing w:before="0" w:after="0" w:line="480" w:lineRule="auto"/>
               <w:ind w:firstLine="0"/>
               <w:jc w:val="center"/>
             </w:pPr>
@@ -2728,7 +2640,7 @@
           </w:tcPr>
           <w:p>
             <w:pPr>
-              <w:spacing w:before="0" w:after="0" w:line="276" w:lineRule="auto"/>
+              <w:spacing w:before="0" w:after="0" w:line="480" w:lineRule="auto"/>
               <w:ind w:firstLine="0"/>
               <w:jc w:val="center"/>
             </w:pPr>
@@ -2759,7 +2671,7 @@
           </w:tcPr>
           <w:p>
             <w:pPr>
-              <w:spacing w:before="0" w:after="0" w:line="276" w:lineRule="auto"/>
+              <w:spacing w:before="0" w:after="0" w:line="480" w:lineRule="auto"/>
               <w:ind w:firstLine="0"/>
               <w:jc w:val="center"/>
             </w:pPr>
@@ -2792,7 +2704,7 @@
           </w:tcPr>
           <w:p>
             <w:pPr>
-              <w:spacing w:before="0" w:after="0" w:line="276" w:lineRule="auto"/>
+              <w:spacing w:before="0" w:after="0" w:line="480" w:lineRule="auto"/>
               <w:ind w:firstLine="0"/>
               <w:jc w:val="center"/>
             </w:pPr>
@@ -2823,7 +2735,7 @@
           </w:tcPr>
           <w:p>
             <w:pPr>
-              <w:spacing w:before="0" w:after="0" w:line="276" w:lineRule="auto"/>
+              <w:spacing w:before="0" w:after="0" w:line="480" w:lineRule="auto"/>
               <w:ind w:firstLine="0"/>
               <w:jc w:val="center"/>
             </w:pPr>
@@ -2854,7 +2766,7 @@
           </w:tcPr>
           <w:p>
             <w:pPr>
-              <w:spacing w:before="0" w:after="0" w:line="276" w:lineRule="auto"/>
+              <w:spacing w:before="0" w:after="0" w:line="480" w:lineRule="auto"/>
               <w:ind w:firstLine="0"/>
               <w:jc w:val="center"/>
             </w:pPr>
@@ -2885,7 +2797,7 @@
           </w:tcPr>
           <w:p>
             <w:pPr>
-              <w:spacing w:before="0" w:after="0" w:line="276" w:lineRule="auto"/>
+              <w:spacing w:before="0" w:after="0" w:line="480" w:lineRule="auto"/>
               <w:ind w:firstLine="0"/>
               <w:jc w:val="center"/>
             </w:pPr>
@@ -2916,7 +2828,7 @@
           </w:tcPr>
           <w:p>
             <w:pPr>
-              <w:spacing w:before="0" w:after="0" w:line="276" w:lineRule="auto"/>
+              <w:spacing w:before="0" w:after="0" w:line="480" w:lineRule="auto"/>
               <w:ind w:firstLine="0"/>
               <w:jc w:val="center"/>
             </w:pPr>
@@ -2947,7 +2859,7 @@
           </w:tcPr>
           <w:p>
             <w:pPr>
-              <w:spacing w:before="0" w:after="0" w:line="276" w:lineRule="auto"/>
+              <w:spacing w:before="0" w:after="0" w:line="480" w:lineRule="auto"/>
               <w:ind w:firstLine="0"/>
               <w:jc w:val="center"/>
             </w:pPr>
@@ -2980,7 +2892,7 @@
           </w:tcPr>
           <w:p>
             <w:pPr>
-              <w:spacing w:before="0" w:after="0" w:line="276" w:lineRule="auto"/>
+              <w:spacing w:before="0" w:after="0" w:line="480" w:lineRule="auto"/>
               <w:ind w:firstLine="0"/>
               <w:jc w:val="center"/>
             </w:pPr>
@@ -3011,7 +2923,7 @@
           </w:tcPr>
           <w:p>
             <w:pPr>
-              <w:spacing w:before="0" w:after="0" w:line="276" w:lineRule="auto"/>
+              <w:spacing w:before="0" w:after="0" w:line="480" w:lineRule="auto"/>
               <w:ind w:firstLine="0"/>
               <w:jc w:val="center"/>
             </w:pPr>
@@ -3042,7 +2954,7 @@
           </w:tcPr>
           <w:p>
             <w:pPr>
-              <w:spacing w:before="0" w:after="0" w:line="276" w:lineRule="auto"/>
+              <w:spacing w:before="0" w:after="0" w:line="480" w:lineRule="auto"/>
               <w:ind w:firstLine="0"/>
               <w:jc w:val="center"/>
             </w:pPr>
@@ -3073,7 +2985,7 @@
           </w:tcPr>
           <w:p>
             <w:pPr>
-              <w:spacing w:before="0" w:after="0" w:line="276" w:lineRule="auto"/>
+              <w:spacing w:before="0" w:after="0" w:line="480" w:lineRule="auto"/>
               <w:ind w:firstLine="0"/>
               <w:jc w:val="center"/>
             </w:pPr>
@@ -3104,7 +3016,7 @@
           </w:tcPr>
           <w:p>
             <w:pPr>
-              <w:spacing w:before="0" w:after="0" w:line="276" w:lineRule="auto"/>
+              <w:spacing w:before="0" w:after="0" w:line="480" w:lineRule="auto"/>
               <w:ind w:firstLine="0"/>
               <w:jc w:val="center"/>
             </w:pPr>
@@ -3135,7 +3047,7 @@
           </w:tcPr>
           <w:p>
             <w:pPr>
-              <w:spacing w:before="0" w:after="0" w:line="276" w:lineRule="auto"/>
+              <w:spacing w:before="0" w:after="0" w:line="480" w:lineRule="auto"/>
               <w:ind w:firstLine="0"/>
               <w:jc w:val="center"/>
             </w:pPr>
@@ -3168,7 +3080,7 @@
           </w:tcPr>
           <w:p>
             <w:pPr>
-              <w:spacing w:before="0" w:after="0" w:line="276" w:lineRule="auto"/>
+              <w:spacing w:before="0" w:after="0" w:line="480" w:lineRule="auto"/>
               <w:ind w:firstLine="0"/>
               <w:jc w:val="center"/>
             </w:pPr>
@@ -3199,7 +3111,7 @@
           </w:tcPr>
           <w:p>
             <w:pPr>
-              <w:spacing w:before="0" w:after="0" w:line="276" w:lineRule="auto"/>
+              <w:spacing w:before="0" w:after="0" w:line="480" w:lineRule="auto"/>
               <w:ind w:firstLine="0"/>
               <w:jc w:val="center"/>
             </w:pPr>
@@ -3230,7 +3142,7 @@
           </w:tcPr>
           <w:p>
             <w:pPr>
-              <w:spacing w:before="0" w:after="0" w:line="276" w:lineRule="auto"/>
+              <w:spacing w:before="0" w:after="0" w:line="480" w:lineRule="auto"/>
               <w:ind w:firstLine="0"/>
               <w:jc w:val="center"/>
             </w:pPr>
@@ -3261,7 +3173,7 @@
           </w:tcPr>
           <w:p>
             <w:pPr>
-              <w:spacing w:before="0" w:after="0" w:line="276" w:lineRule="auto"/>
+              <w:spacing w:before="0" w:after="0" w:line="480" w:lineRule="auto"/>
               <w:ind w:firstLine="0"/>
               <w:jc w:val="center"/>
             </w:pPr>
@@ -3292,7 +3204,7 @@
           </w:tcPr>
           <w:p>
             <w:pPr>
-              <w:spacing w:before="0" w:after="0" w:line="276" w:lineRule="auto"/>
+              <w:spacing w:before="0" w:after="0" w:line="480" w:lineRule="auto"/>
               <w:ind w:firstLine="0"/>
               <w:jc w:val="center"/>
             </w:pPr>
@@ -3323,7 +3235,7 @@
           </w:tcPr>
           <w:p>
             <w:pPr>
-              <w:spacing w:before="0" w:after="0" w:line="276" w:lineRule="auto"/>
+              <w:spacing w:before="0" w:after="0" w:line="480" w:lineRule="auto"/>
               <w:ind w:firstLine="0"/>
               <w:jc w:val="center"/>
             </w:pPr>
@@ -3356,7 +3268,7 @@
           </w:tcPr>
           <w:p>
             <w:pPr>
-              <w:spacing w:before="0" w:after="0" w:line="276" w:lineRule="auto"/>
+              <w:spacing w:before="0" w:after="0" w:line="480" w:lineRule="auto"/>
               <w:ind w:firstLine="0"/>
               <w:jc w:val="center"/>
             </w:pPr>
@@ -3387,7 +3299,7 @@
           </w:tcPr>
           <w:p>
             <w:pPr>
-              <w:spacing w:before="0" w:after="0" w:line="276" w:lineRule="auto"/>
+              <w:spacing w:before="0" w:after="0" w:line="480" w:lineRule="auto"/>
               <w:ind w:firstLine="0"/>
               <w:jc w:val="center"/>
             </w:pPr>
@@ -3418,7 +3330,7 @@
           </w:tcPr>
           <w:p>
             <w:pPr>
-              <w:spacing w:before="0" w:after="0" w:line="276" w:lineRule="auto"/>
+              <w:spacing w:before="0" w:after="0" w:line="480" w:lineRule="auto"/>
               <w:ind w:firstLine="0"/>
               <w:jc w:val="center"/>
             </w:pPr>
@@ -3449,7 +3361,7 @@
           </w:tcPr>
           <w:p>
             <w:pPr>
-              <w:spacing w:before="0" w:after="0" w:line="276" w:lineRule="auto"/>
+              <w:spacing w:before="0" w:after="0" w:line="480" w:lineRule="auto"/>
               <w:ind w:firstLine="0"/>
               <w:jc w:val="center"/>
             </w:pPr>
@@ -3480,7 +3392,7 @@
           </w:tcPr>
           <w:p>
             <w:pPr>
-              <w:spacing w:before="0" w:after="0" w:line="276" w:lineRule="auto"/>
+              <w:spacing w:before="0" w:after="0" w:line="480" w:lineRule="auto"/>
               <w:ind w:firstLine="0"/>
               <w:jc w:val="center"/>
             </w:pPr>
@@ -3511,7 +3423,7 @@
           </w:tcPr>
           <w:p>
             <w:pPr>
-              <w:spacing w:before="0" w:after="0" w:line="276" w:lineRule="auto"/>
+              <w:spacing w:before="0" w:after="0" w:line="480" w:lineRule="auto"/>
               <w:ind w:firstLine="0"/>
               <w:jc w:val="center"/>
             </w:pPr>
@@ -3544,7 +3456,7 @@
           </w:tcPr>
           <w:p>
             <w:pPr>
-              <w:spacing w:before="0" w:after="0" w:line="276" w:lineRule="auto"/>
+              <w:spacing w:before="0" w:after="0" w:line="480" w:lineRule="auto"/>
               <w:ind w:firstLine="0"/>
               <w:jc w:val="center"/>
             </w:pPr>
@@ -3575,7 +3487,7 @@
           </w:tcPr>
           <w:p>
             <w:pPr>
-              <w:spacing w:before="0" w:after="0" w:line="276" w:lineRule="auto"/>
+              <w:spacing w:before="0" w:after="0" w:line="480" w:lineRule="auto"/>
               <w:ind w:firstLine="0"/>
               <w:jc w:val="center"/>
             </w:pPr>
@@ -3606,7 +3518,7 @@
           </w:tcPr>
           <w:p>
             <w:pPr>
-              <w:spacing w:before="0" w:after="0" w:line="276" w:lineRule="auto"/>
+              <w:spacing w:before="0" w:after="0" w:line="480" w:lineRule="auto"/>
               <w:ind w:firstLine="0"/>
               <w:jc w:val="center"/>
             </w:pPr>
@@ -3637,7 +3549,7 @@
           </w:tcPr>
           <w:p>
             <w:pPr>
-              <w:spacing w:before="0" w:after="0" w:line="276" w:lineRule="auto"/>
+              <w:spacing w:before="0" w:after="0" w:line="480" w:lineRule="auto"/>
               <w:ind w:firstLine="0"/>
               <w:jc w:val="center"/>
             </w:pPr>
@@ -3668,7 +3580,7 @@
           </w:tcPr>
           <w:p>
             <w:pPr>
-              <w:spacing w:before="0" w:after="0" w:line="276" w:lineRule="auto"/>
+              <w:spacing w:before="0" w:after="0" w:line="480" w:lineRule="auto"/>
               <w:ind w:firstLine="0"/>
               <w:jc w:val="center"/>
             </w:pPr>
@@ -3699,7 +3611,7 @@
           </w:tcPr>
           <w:p>
             <w:pPr>
-              <w:spacing w:before="0" w:after="0" w:line="276" w:lineRule="auto"/>
+              <w:spacing w:before="0" w:after="0" w:line="480" w:lineRule="auto"/>
               <w:ind w:firstLine="0"/>
               <w:jc w:val="center"/>
             </w:pPr>
@@ -3717,6 +3629,23 @@
         </w:tc>
       </w:tr>
     </w:tbl>
+    <w:p>
+      <w:pPr>
+        <w:spacing w:before="60" w:after="240" w:line="480" w:lineRule="auto"/>
+        <w:ind w:firstLine="0"/>
+        <w:jc w:val="both"/>
+      </w:pPr>
+      <w:r>
+        <w:rPr>
+          <w:rFonts w:ascii="Times New Roman" w:hAnsi="Times New Roman" w:eastAsia="Times New Roman"/>
+          <w:b w:val="0"/>
+          <w:i/>
+          <w:color w:val="000000"/>
+          <w:sz w:val="22"/>
+        </w:rPr>
+        <w:t>Note: Pairwise correlations in the estimation sample. Data source: World Bank World Development Indicators (2024).</w:t>
+      </w:r>
+    </w:p>
     <w:p>
       <w:pPr>
         <w:spacing w:before="240" w:after="120" w:line="480" w:lineRule="auto"/>
@@ -3764,7 +3693,7 @@
           </w:tcPr>
           <w:p>
             <w:pPr>
-              <w:spacing w:before="0" w:after="0" w:line="276" w:lineRule="auto"/>
+              <w:spacing w:before="0" w:after="0" w:line="480" w:lineRule="auto"/>
               <w:ind w:firstLine="0"/>
               <w:jc w:val="center"/>
             </w:pPr>
@@ -3795,7 +3724,7 @@
           </w:tcPr>
           <w:p>
             <w:pPr>
-              <w:spacing w:before="0" w:after="0" w:line="276" w:lineRule="auto"/>
+              <w:spacing w:before="0" w:after="0" w:line="480" w:lineRule="auto"/>
               <w:ind w:firstLine="0"/>
               <w:jc w:val="center"/>
             </w:pPr>
@@ -3826,7 +3755,7 @@
           </w:tcPr>
           <w:p>
             <w:pPr>
-              <w:spacing w:before="0" w:after="0" w:line="276" w:lineRule="auto"/>
+              <w:spacing w:before="0" w:after="0" w:line="480" w:lineRule="auto"/>
               <w:ind w:firstLine="0"/>
               <w:jc w:val="center"/>
             </w:pPr>
@@ -3857,7 +3786,7 @@
           </w:tcPr>
           <w:p>
             <w:pPr>
-              <w:spacing w:before="0" w:after="0" w:line="276" w:lineRule="auto"/>
+              <w:spacing w:before="0" w:after="0" w:line="480" w:lineRule="auto"/>
               <w:ind w:firstLine="0"/>
               <w:jc w:val="center"/>
             </w:pPr>
@@ -3888,7 +3817,7 @@
           </w:tcPr>
           <w:p>
             <w:pPr>
-              <w:spacing w:before="0" w:after="0" w:line="276" w:lineRule="auto"/>
+              <w:spacing w:before="0" w:after="0" w:line="480" w:lineRule="auto"/>
               <w:ind w:firstLine="0"/>
               <w:jc w:val="center"/>
             </w:pPr>
@@ -3919,7 +3848,7 @@
           </w:tcPr>
           <w:p>
             <w:pPr>
-              <w:spacing w:before="0" w:after="0" w:line="276" w:lineRule="auto"/>
+              <w:spacing w:before="0" w:after="0" w:line="480" w:lineRule="auto"/>
               <w:ind w:firstLine="0"/>
               <w:jc w:val="center"/>
             </w:pPr>
@@ -3952,7 +3881,7 @@
           </w:tcPr>
           <w:p>
             <w:pPr>
-              <w:spacing w:before="0" w:after="0" w:line="276" w:lineRule="auto"/>
+              <w:spacing w:before="0" w:after="0" w:line="480" w:lineRule="auto"/>
               <w:ind w:firstLine="0"/>
               <w:jc w:val="center"/>
             </w:pPr>
@@ -3983,7 +3912,7 @@
           </w:tcPr>
           <w:p>
             <w:pPr>
-              <w:spacing w:before="0" w:after="0" w:line="276" w:lineRule="auto"/>
+              <w:spacing w:before="0" w:after="0" w:line="480" w:lineRule="auto"/>
               <w:ind w:firstLine="0"/>
               <w:jc w:val="center"/>
             </w:pPr>
@@ -4014,7 +3943,7 @@
           </w:tcPr>
           <w:p>
             <w:pPr>
-              <w:spacing w:before="0" w:after="0" w:line="276" w:lineRule="auto"/>
+              <w:spacing w:before="0" w:after="0" w:line="480" w:lineRule="auto"/>
               <w:ind w:firstLine="0"/>
               <w:jc w:val="center"/>
             </w:pPr>
@@ -4045,7 +3974,7 @@
           </w:tcPr>
           <w:p>
             <w:pPr>
-              <w:spacing w:before="0" w:after="0" w:line="276" w:lineRule="auto"/>
+              <w:spacing w:before="0" w:after="0" w:line="480" w:lineRule="auto"/>
               <w:ind w:firstLine="0"/>
               <w:jc w:val="center"/>
             </w:pPr>
@@ -4076,7 +4005,7 @@
           </w:tcPr>
           <w:p>
             <w:pPr>
-              <w:spacing w:before="0" w:after="0" w:line="276" w:lineRule="auto"/>
+              <w:spacing w:before="0" w:after="0" w:line="480" w:lineRule="auto"/>
               <w:ind w:firstLine="0"/>
               <w:jc w:val="center"/>
             </w:pPr>
@@ -4107,7 +4036,7 @@
           </w:tcPr>
           <w:p>
             <w:pPr>
-              <w:spacing w:before="0" w:after="0" w:line="276" w:lineRule="auto"/>
+              <w:spacing w:before="0" w:after="0" w:line="480" w:lineRule="auto"/>
               <w:ind w:firstLine="0"/>
               <w:jc w:val="center"/>
             </w:pPr>
@@ -4140,7 +4069,7 @@
           </w:tcPr>
           <w:p>
             <w:pPr>
-              <w:spacing w:before="0" w:after="0" w:line="276" w:lineRule="auto"/>
+              <w:spacing w:before="0" w:after="0" w:line="480" w:lineRule="auto"/>
               <w:ind w:firstLine="0"/>
               <w:jc w:val="center"/>
             </w:pPr>
@@ -4171,7 +4100,7 @@
           </w:tcPr>
           <w:p>
             <w:pPr>
-              <w:spacing w:before="0" w:after="0" w:line="276" w:lineRule="auto"/>
+              <w:spacing w:before="0" w:after="0" w:line="480" w:lineRule="auto"/>
               <w:ind w:firstLine="0"/>
               <w:jc w:val="center"/>
             </w:pPr>
@@ -4202,7 +4131,7 @@
           </w:tcPr>
           <w:p>
             <w:pPr>
-              <w:spacing w:before="0" w:after="0" w:line="276" w:lineRule="auto"/>
+              <w:spacing w:before="0" w:after="0" w:line="480" w:lineRule="auto"/>
               <w:ind w:firstLine="0"/>
               <w:jc w:val="center"/>
             </w:pPr>
@@ -4233,7 +4162,7 @@
           </w:tcPr>
           <w:p>
             <w:pPr>
-              <w:spacing w:before="0" w:after="0" w:line="276" w:lineRule="auto"/>
+              <w:spacing w:before="0" w:after="0" w:line="480" w:lineRule="auto"/>
               <w:ind w:firstLine="0"/>
               <w:jc w:val="center"/>
             </w:pPr>
@@ -4264,7 +4193,7 @@
           </w:tcPr>
           <w:p>
             <w:pPr>
-              <w:spacing w:before="0" w:after="0" w:line="276" w:lineRule="auto"/>
+              <w:spacing w:before="0" w:after="0" w:line="480" w:lineRule="auto"/>
               <w:ind w:firstLine="0"/>
               <w:jc w:val="center"/>
             </w:pPr>
@@ -4295,7 +4224,7 @@
           </w:tcPr>
           <w:p>
             <w:pPr>
-              <w:spacing w:before="0" w:after="0" w:line="276" w:lineRule="auto"/>
+              <w:spacing w:before="0" w:after="0" w:line="480" w:lineRule="auto"/>
               <w:ind w:firstLine="0"/>
               <w:jc w:val="center"/>
             </w:pPr>
@@ -4328,7 +4257,7 @@
           </w:tcPr>
           <w:p>
             <w:pPr>
-              <w:spacing w:before="0" w:after="0" w:line="276" w:lineRule="auto"/>
+              <w:spacing w:before="0" w:after="0" w:line="480" w:lineRule="auto"/>
               <w:ind w:firstLine="0"/>
               <w:jc w:val="center"/>
             </w:pPr>
@@ -4359,7 +4288,7 @@
           </w:tcPr>
           <w:p>
             <w:pPr>
-              <w:spacing w:before="0" w:after="0" w:line="276" w:lineRule="auto"/>
+              <w:spacing w:before="0" w:after="0" w:line="480" w:lineRule="auto"/>
               <w:ind w:firstLine="0"/>
               <w:jc w:val="center"/>
             </w:pPr>
@@ -4390,7 +4319,7 @@
           </w:tcPr>
           <w:p>
             <w:pPr>
-              <w:spacing w:before="0" w:after="0" w:line="276" w:lineRule="auto"/>
+              <w:spacing w:before="0" w:after="0" w:line="480" w:lineRule="auto"/>
               <w:ind w:firstLine="0"/>
               <w:jc w:val="center"/>
             </w:pPr>
@@ -4421,7 +4350,7 @@
           </w:tcPr>
           <w:p>
             <w:pPr>
-              <w:spacing w:before="0" w:after="0" w:line="276" w:lineRule="auto"/>
+              <w:spacing w:before="0" w:after="0" w:line="480" w:lineRule="auto"/>
               <w:ind w:firstLine="0"/>
               <w:jc w:val="center"/>
             </w:pPr>
@@ -4452,7 +4381,7 @@
           </w:tcPr>
           <w:p>
             <w:pPr>
-              <w:spacing w:before="0" w:after="0" w:line="276" w:lineRule="auto"/>
+              <w:spacing w:before="0" w:after="0" w:line="480" w:lineRule="auto"/>
               <w:ind w:firstLine="0"/>
               <w:jc w:val="center"/>
             </w:pPr>
@@ -4483,7 +4412,7 @@
           </w:tcPr>
           <w:p>
             <w:pPr>
-              <w:spacing w:before="0" w:after="0" w:line="276" w:lineRule="auto"/>
+              <w:spacing w:before="0" w:after="0" w:line="480" w:lineRule="auto"/>
               <w:ind w:firstLine="0"/>
               <w:jc w:val="center"/>
             </w:pPr>
@@ -4516,7 +4445,7 @@
           </w:tcPr>
           <w:p>
             <w:pPr>
-              <w:spacing w:before="0" w:after="0" w:line="276" w:lineRule="auto"/>
+              <w:spacing w:before="0" w:after="0" w:line="480" w:lineRule="auto"/>
               <w:ind w:firstLine="0"/>
               <w:jc w:val="center"/>
             </w:pPr>
@@ -4547,7 +4476,7 @@
           </w:tcPr>
           <w:p>
             <w:pPr>
-              <w:spacing w:before="0" w:after="0" w:line="276" w:lineRule="auto"/>
+              <w:spacing w:before="0" w:after="0" w:line="480" w:lineRule="auto"/>
               <w:ind w:firstLine="0"/>
               <w:jc w:val="center"/>
             </w:pPr>
@@ -4578,7 +4507,7 @@
           </w:tcPr>
           <w:p>
             <w:pPr>
-              <w:spacing w:before="0" w:after="0" w:line="276" w:lineRule="auto"/>
+              <w:spacing w:before="0" w:after="0" w:line="480" w:lineRule="auto"/>
               <w:ind w:firstLine="0"/>
               <w:jc w:val="center"/>
             </w:pPr>
@@ -4609,7 +4538,7 @@
           </w:tcPr>
           <w:p>
             <w:pPr>
-              <w:spacing w:before="0" w:after="0" w:line="276" w:lineRule="auto"/>
+              <w:spacing w:before="0" w:after="0" w:line="480" w:lineRule="auto"/>
               <w:ind w:firstLine="0"/>
               <w:jc w:val="center"/>
             </w:pPr>
@@ -4640,7 +4569,7 @@
           </w:tcPr>
           <w:p>
             <w:pPr>
-              <w:spacing w:before="0" w:after="0" w:line="276" w:lineRule="auto"/>
+              <w:spacing w:before="0" w:after="0" w:line="480" w:lineRule="auto"/>
               <w:ind w:firstLine="0"/>
               <w:jc w:val="center"/>
             </w:pPr>
@@ -4671,7 +4600,7 @@
           </w:tcPr>
           <w:p>
             <w:pPr>
-              <w:spacing w:before="0" w:after="0" w:line="276" w:lineRule="auto"/>
+              <w:spacing w:before="0" w:after="0" w:line="480" w:lineRule="auto"/>
               <w:ind w:firstLine="0"/>
               <w:jc w:val="center"/>
             </w:pPr>
@@ -4703,7 +4632,7 @@
           <w:color w:val="000000"/>
           <w:sz w:val="22"/>
         </w:rPr>
-        <w:t>Note: Reject 5% counts how many country-specific ADF tests reject the unit-root null at the 5% level. The Fisher chi2 statistic combines individual p-values across countries; a low p-value indicates that the series is persistent in most countries. Cointegration tests are Engle-Granger residual ADF tests from a regression of log GDP per capita on log trade, log investment, schooling, and population growth.</w:t>
+        <w:t>Note: Reject 5% counts country-specific ADF tests rejecting the unit-root null. The Fisher chi2 statistic combines p-values across countries. Cointegration tests are Engle-Granger residual ADF tests from a regression of log GDP per capita on log trade, log investment, schooling, and population growth. Data source: World Bank World Development Indicators (2024).</w:t>
       </w:r>
     </w:p>
     <w:p>
@@ -4752,7 +4681,7 @@
           </w:tcPr>
           <w:p>
             <w:pPr>
-              <w:spacing w:before="0" w:after="0" w:line="276" w:lineRule="auto"/>
+              <w:spacing w:before="0" w:after="0" w:line="480" w:lineRule="auto"/>
               <w:ind w:firstLine="0"/>
               <w:jc w:val="center"/>
             </w:pPr>
@@ -4783,7 +4712,7 @@
           </w:tcPr>
           <w:p>
             <w:pPr>
-              <w:spacing w:before="0" w:after="0" w:line="276" w:lineRule="auto"/>
+              <w:spacing w:before="0" w:after="0" w:line="480" w:lineRule="auto"/>
               <w:ind w:firstLine="0"/>
               <w:jc w:val="center"/>
             </w:pPr>
@@ -4814,7 +4743,7 @@
           </w:tcPr>
           <w:p>
             <w:pPr>
-              <w:spacing w:before="0" w:after="0" w:line="276" w:lineRule="auto"/>
+              <w:spacing w:before="0" w:after="0" w:line="480" w:lineRule="auto"/>
               <w:ind w:firstLine="0"/>
               <w:jc w:val="center"/>
             </w:pPr>
@@ -4845,7 +4774,7 @@
           </w:tcPr>
           <w:p>
             <w:pPr>
-              <w:spacing w:before="0" w:after="0" w:line="276" w:lineRule="auto"/>
+              <w:spacing w:before="0" w:after="0" w:line="480" w:lineRule="auto"/>
               <w:ind w:firstLine="0"/>
               <w:jc w:val="center"/>
             </w:pPr>
@@ -4876,7 +4805,7 @@
           </w:tcPr>
           <w:p>
             <w:pPr>
-              <w:spacing w:before="0" w:after="0" w:line="276" w:lineRule="auto"/>
+              <w:spacing w:before="0" w:after="0" w:line="480" w:lineRule="auto"/>
               <w:ind w:firstLine="0"/>
               <w:jc w:val="center"/>
             </w:pPr>
@@ -4909,7 +4838,7 @@
           </w:tcPr>
           <w:p>
             <w:pPr>
-              <w:spacing w:before="0" w:after="0" w:line="276" w:lineRule="auto"/>
+              <w:spacing w:before="0" w:after="0" w:line="480" w:lineRule="auto"/>
               <w:ind w:firstLine="0"/>
               <w:jc w:val="center"/>
             </w:pPr>
@@ -4940,7 +4869,7 @@
           </w:tcPr>
           <w:p>
             <w:pPr>
-              <w:spacing w:before="0" w:after="0" w:line="276" w:lineRule="auto"/>
+              <w:spacing w:before="0" w:after="0" w:line="480" w:lineRule="auto"/>
               <w:ind w:firstLine="0"/>
               <w:jc w:val="center"/>
             </w:pPr>
@@ -4971,7 +4900,7 @@
           </w:tcPr>
           <w:p>
             <w:pPr>
-              <w:spacing w:before="0" w:after="0" w:line="276" w:lineRule="auto"/>
+              <w:spacing w:before="0" w:after="0" w:line="480" w:lineRule="auto"/>
               <w:ind w:firstLine="0"/>
               <w:jc w:val="center"/>
             </w:pPr>
@@ -5002,7 +4931,7 @@
           </w:tcPr>
           <w:p>
             <w:pPr>
-              <w:spacing w:before="0" w:after="0" w:line="276" w:lineRule="auto"/>
+              <w:spacing w:before="0" w:after="0" w:line="480" w:lineRule="auto"/>
               <w:ind w:firstLine="0"/>
               <w:jc w:val="center"/>
             </w:pPr>
@@ -5033,7 +4962,7 @@
           </w:tcPr>
           <w:p>
             <w:pPr>
-              <w:spacing w:before="0" w:after="0" w:line="276" w:lineRule="auto"/>
+              <w:spacing w:before="0" w:after="0" w:line="480" w:lineRule="auto"/>
               <w:ind w:firstLine="0"/>
               <w:jc w:val="center"/>
             </w:pPr>
@@ -5066,7 +4995,7 @@
           </w:tcPr>
           <w:p>
             <w:pPr>
-              <w:spacing w:before="0" w:after="0" w:line="276" w:lineRule="auto"/>
+              <w:spacing w:before="0" w:after="0" w:line="480" w:lineRule="auto"/>
               <w:ind w:firstLine="0"/>
               <w:jc w:val="center"/>
             </w:pPr>
@@ -5097,7 +5026,7 @@
           </w:tcPr>
           <w:p>
             <w:pPr>
-              <w:spacing w:before="0" w:after="0" w:line="276" w:lineRule="auto"/>
+              <w:spacing w:before="0" w:after="0" w:line="480" w:lineRule="auto"/>
               <w:ind w:firstLine="0"/>
               <w:jc w:val="center"/>
             </w:pPr>
@@ -5128,7 +5057,7 @@
           </w:tcPr>
           <w:p>
             <w:pPr>
-              <w:spacing w:before="0" w:after="0" w:line="276" w:lineRule="auto"/>
+              <w:spacing w:before="0" w:after="0" w:line="480" w:lineRule="auto"/>
               <w:ind w:firstLine="0"/>
               <w:jc w:val="center"/>
             </w:pPr>
@@ -5159,7 +5088,7 @@
           </w:tcPr>
           <w:p>
             <w:pPr>
-              <w:spacing w:before="0" w:after="0" w:line="276" w:lineRule="auto"/>
+              <w:spacing w:before="0" w:after="0" w:line="480" w:lineRule="auto"/>
               <w:ind w:firstLine="0"/>
               <w:jc w:val="center"/>
             </w:pPr>
@@ -5190,7 +5119,7 @@
           </w:tcPr>
           <w:p>
             <w:pPr>
-              <w:spacing w:before="0" w:after="0" w:line="276" w:lineRule="auto"/>
+              <w:spacing w:before="0" w:after="0" w:line="480" w:lineRule="auto"/>
               <w:ind w:firstLine="0"/>
               <w:jc w:val="center"/>
             </w:pPr>
@@ -5223,7 +5152,7 @@
           </w:tcPr>
           <w:p>
             <w:pPr>
-              <w:spacing w:before="0" w:after="0" w:line="276" w:lineRule="auto"/>
+              <w:spacing w:before="0" w:after="0" w:line="480" w:lineRule="auto"/>
               <w:ind w:firstLine="0"/>
               <w:jc w:val="center"/>
             </w:pPr>
@@ -5254,7 +5183,7 @@
           </w:tcPr>
           <w:p>
             <w:pPr>
-              <w:spacing w:before="0" w:after="0" w:line="276" w:lineRule="auto"/>
+              <w:spacing w:before="0" w:after="0" w:line="480" w:lineRule="auto"/>
               <w:ind w:firstLine="0"/>
               <w:jc w:val="center"/>
             </w:pPr>
@@ -5285,7 +5214,7 @@
           </w:tcPr>
           <w:p>
             <w:pPr>
-              <w:spacing w:before="0" w:after="0" w:line="276" w:lineRule="auto"/>
+              <w:spacing w:before="0" w:after="0" w:line="480" w:lineRule="auto"/>
               <w:ind w:firstLine="0"/>
               <w:jc w:val="center"/>
             </w:pPr>
@@ -5316,7 +5245,7 @@
           </w:tcPr>
           <w:p>
             <w:pPr>
-              <w:spacing w:before="0" w:after="0" w:line="276" w:lineRule="auto"/>
+              <w:spacing w:before="0" w:after="0" w:line="480" w:lineRule="auto"/>
               <w:ind w:firstLine="0"/>
               <w:jc w:val="center"/>
             </w:pPr>
@@ -5347,7 +5276,7 @@
           </w:tcPr>
           <w:p>
             <w:pPr>
-              <w:spacing w:before="0" w:after="0" w:line="276" w:lineRule="auto"/>
+              <w:spacing w:before="0" w:after="0" w:line="480" w:lineRule="auto"/>
               <w:ind w:firstLine="0"/>
               <w:jc w:val="center"/>
             </w:pPr>
@@ -5380,7 +5309,7 @@
           </w:tcPr>
           <w:p>
             <w:pPr>
-              <w:spacing w:before="0" w:after="0" w:line="276" w:lineRule="auto"/>
+              <w:spacing w:before="0" w:after="0" w:line="480" w:lineRule="auto"/>
               <w:ind w:firstLine="0"/>
               <w:jc w:val="center"/>
             </w:pPr>
@@ -5411,7 +5340,7 @@
           </w:tcPr>
           <w:p>
             <w:pPr>
-              <w:spacing w:before="0" w:after="0" w:line="276" w:lineRule="auto"/>
+              <w:spacing w:before="0" w:after="0" w:line="480" w:lineRule="auto"/>
               <w:ind w:firstLine="0"/>
               <w:jc w:val="center"/>
             </w:pPr>
@@ -5442,7 +5371,7 @@
           </w:tcPr>
           <w:p>
             <w:pPr>
-              <w:spacing w:before="0" w:after="0" w:line="276" w:lineRule="auto"/>
+              <w:spacing w:before="0" w:after="0" w:line="480" w:lineRule="auto"/>
               <w:ind w:firstLine="0"/>
               <w:jc w:val="center"/>
             </w:pPr>
@@ -5473,7 +5402,7 @@
           </w:tcPr>
           <w:p>
             <w:pPr>
-              <w:spacing w:before="0" w:after="0" w:line="276" w:lineRule="auto"/>
+              <w:spacing w:before="0" w:after="0" w:line="480" w:lineRule="auto"/>
               <w:ind w:firstLine="0"/>
               <w:jc w:val="center"/>
             </w:pPr>
@@ -5504,7 +5433,7 @@
           </w:tcPr>
           <w:p>
             <w:pPr>
-              <w:spacing w:before="0" w:after="0" w:line="276" w:lineRule="auto"/>
+              <w:spacing w:before="0" w:after="0" w:line="480" w:lineRule="auto"/>
               <w:ind w:firstLine="0"/>
               <w:jc w:val="center"/>
             </w:pPr>
@@ -5537,7 +5466,7 @@
           </w:tcPr>
           <w:p>
             <w:pPr>
-              <w:spacing w:before="0" w:after="0" w:line="276" w:lineRule="auto"/>
+              <w:spacing w:before="0" w:after="0" w:line="480" w:lineRule="auto"/>
               <w:ind w:firstLine="0"/>
               <w:jc w:val="center"/>
             </w:pPr>
@@ -5568,7 +5497,7 @@
           </w:tcPr>
           <w:p>
             <w:pPr>
-              <w:spacing w:before="0" w:after="0" w:line="276" w:lineRule="auto"/>
+              <w:spacing w:before="0" w:after="0" w:line="480" w:lineRule="auto"/>
               <w:ind w:firstLine="0"/>
               <w:jc w:val="center"/>
             </w:pPr>
@@ -5599,7 +5528,7 @@
           </w:tcPr>
           <w:p>
             <w:pPr>
-              <w:spacing w:before="0" w:after="0" w:line="276" w:lineRule="auto"/>
+              <w:spacing w:before="0" w:after="0" w:line="480" w:lineRule="auto"/>
               <w:ind w:firstLine="0"/>
               <w:jc w:val="center"/>
             </w:pPr>
@@ -5630,7 +5559,7 @@
           </w:tcPr>
           <w:p>
             <w:pPr>
-              <w:spacing w:before="0" w:after="0" w:line="276" w:lineRule="auto"/>
+              <w:spacing w:before="0" w:after="0" w:line="480" w:lineRule="auto"/>
               <w:ind w:firstLine="0"/>
               <w:jc w:val="center"/>
             </w:pPr>
@@ -5661,7 +5590,7 @@
           </w:tcPr>
           <w:p>
             <w:pPr>
-              <w:spacing w:before="0" w:after="0" w:line="276" w:lineRule="auto"/>
+              <w:spacing w:before="0" w:after="0" w:line="480" w:lineRule="auto"/>
               <w:ind w:firstLine="0"/>
               <w:jc w:val="center"/>
             </w:pPr>
@@ -5694,7 +5623,7 @@
           </w:tcPr>
           <w:p>
             <w:pPr>
-              <w:spacing w:before="0" w:after="0" w:line="276" w:lineRule="auto"/>
+              <w:spacing w:before="0" w:after="0" w:line="480" w:lineRule="auto"/>
               <w:ind w:firstLine="0"/>
               <w:jc w:val="center"/>
             </w:pPr>
@@ -5725,7 +5654,7 @@
           </w:tcPr>
           <w:p>
             <w:pPr>
-              <w:spacing w:before="0" w:after="0" w:line="276" w:lineRule="auto"/>
+              <w:spacing w:before="0" w:after="0" w:line="480" w:lineRule="auto"/>
               <w:ind w:firstLine="0"/>
               <w:jc w:val="center"/>
             </w:pPr>
@@ -5756,7 +5685,7 @@
           </w:tcPr>
           <w:p>
             <w:pPr>
-              <w:spacing w:before="0" w:after="0" w:line="276" w:lineRule="auto"/>
+              <w:spacing w:before="0" w:after="0" w:line="480" w:lineRule="auto"/>
               <w:ind w:firstLine="0"/>
               <w:jc w:val="center"/>
             </w:pPr>
@@ -5787,7 +5716,7 @@
           </w:tcPr>
           <w:p>
             <w:pPr>
-              <w:spacing w:before="0" w:after="0" w:line="276" w:lineRule="auto"/>
+              <w:spacing w:before="0" w:after="0" w:line="480" w:lineRule="auto"/>
               <w:ind w:firstLine="0"/>
               <w:jc w:val="center"/>
             </w:pPr>
@@ -5818,7 +5747,7 @@
           </w:tcPr>
           <w:p>
             <w:pPr>
-              <w:spacing w:before="0" w:after="0" w:line="276" w:lineRule="auto"/>
+              <w:spacing w:before="0" w:after="0" w:line="480" w:lineRule="auto"/>
               <w:ind w:firstLine="0"/>
               <w:jc w:val="center"/>
             </w:pPr>
@@ -5850,7 +5779,7 @@
           <w:color w:val="000000"/>
           <w:sz w:val="22"/>
         </w:rPr>
-        <w:t>Note: *** p&lt;0.01, ** p&lt;0.05, * p&lt;0.1. Standard errors are panel-robust. FE = country fixed effects; TWFE = country and year fixed effects. TWFE absorbs country-specific and year-specific averages; the negative coefficient is a within-year, within-country deviation and does not measure the long-run effect of lowering tariffs. We also attempted a random-effects specification, but it returned a numerical singularity and was dropped; fixed-effects estimates are reported throughout.</w:t>
+        <w:t>Note: *** p&lt;0.01, ** p&lt;0.05, * p&lt;0.1. Standard errors clustered by country. FE = country fixed effects; TE = time fixed effects; TWFE = country and year fixed effects. Data source: World Bank World Development Indicators (2024).</w:t>
       </w:r>
     </w:p>
     <w:p>
@@ -5898,7 +5827,7 @@
           </w:tcPr>
           <w:p>
             <w:pPr>
-              <w:spacing w:before="0" w:after="0" w:line="276" w:lineRule="auto"/>
+              <w:spacing w:before="0" w:after="0" w:line="480" w:lineRule="auto"/>
               <w:ind w:firstLine="0"/>
               <w:jc w:val="center"/>
             </w:pPr>
@@ -5929,7 +5858,7 @@
           </w:tcPr>
           <w:p>
             <w:pPr>
-              <w:spacing w:before="0" w:after="0" w:line="276" w:lineRule="auto"/>
+              <w:spacing w:before="0" w:after="0" w:line="480" w:lineRule="auto"/>
               <w:ind w:firstLine="0"/>
               <w:jc w:val="center"/>
             </w:pPr>
@@ -5960,7 +5889,7 @@
           </w:tcPr>
           <w:p>
             <w:pPr>
-              <w:spacing w:before="0" w:after="0" w:line="276" w:lineRule="auto"/>
+              <w:spacing w:before="0" w:after="0" w:line="480" w:lineRule="auto"/>
               <w:ind w:firstLine="0"/>
               <w:jc w:val="center"/>
             </w:pPr>
@@ -5991,7 +5920,7 @@
           </w:tcPr>
           <w:p>
             <w:pPr>
-              <w:spacing w:before="0" w:after="0" w:line="276" w:lineRule="auto"/>
+              <w:spacing w:before="0" w:after="0" w:line="480" w:lineRule="auto"/>
               <w:ind w:firstLine="0"/>
               <w:jc w:val="center"/>
             </w:pPr>
@@ -6024,7 +5953,7 @@
           </w:tcPr>
           <w:p>
             <w:pPr>
-              <w:spacing w:before="0" w:after="0" w:line="276" w:lineRule="auto"/>
+              <w:spacing w:before="0" w:after="0" w:line="480" w:lineRule="auto"/>
               <w:ind w:firstLine="0"/>
               <w:jc w:val="center"/>
             </w:pPr>
@@ -6055,7 +5984,7 @@
           </w:tcPr>
           <w:p>
             <w:pPr>
-              <w:spacing w:before="0" w:after="0" w:line="276" w:lineRule="auto"/>
+              <w:spacing w:before="0" w:after="0" w:line="480" w:lineRule="auto"/>
               <w:ind w:firstLine="0"/>
               <w:jc w:val="center"/>
             </w:pPr>
@@ -6086,7 +6015,7 @@
           </w:tcPr>
           <w:p>
             <w:pPr>
-              <w:spacing w:before="0" w:after="0" w:line="276" w:lineRule="auto"/>
+              <w:spacing w:before="0" w:after="0" w:line="480" w:lineRule="auto"/>
               <w:ind w:firstLine="0"/>
               <w:jc w:val="center"/>
             </w:pPr>
@@ -6117,7 +6046,7 @@
           </w:tcPr>
           <w:p>
             <w:pPr>
-              <w:spacing w:before="0" w:after="0" w:line="276" w:lineRule="auto"/>
+              <w:spacing w:before="0" w:after="0" w:line="480" w:lineRule="auto"/>
               <w:ind w:firstLine="0"/>
               <w:jc w:val="center"/>
             </w:pPr>
@@ -6150,7 +6079,7 @@
           </w:tcPr>
           <w:p>
             <w:pPr>
-              <w:spacing w:before="0" w:after="0" w:line="276" w:lineRule="auto"/>
+              <w:spacing w:before="0" w:after="0" w:line="480" w:lineRule="auto"/>
               <w:ind w:firstLine="0"/>
               <w:jc w:val="center"/>
             </w:pPr>
@@ -6181,7 +6110,7 @@
           </w:tcPr>
           <w:p>
             <w:pPr>
-              <w:spacing w:before="0" w:after="0" w:line="276" w:lineRule="auto"/>
+              <w:spacing w:before="0" w:after="0" w:line="480" w:lineRule="auto"/>
               <w:ind w:firstLine="0"/>
               <w:jc w:val="center"/>
             </w:pPr>
@@ -6212,7 +6141,7 @@
           </w:tcPr>
           <w:p>
             <w:pPr>
-              <w:spacing w:before="0" w:after="0" w:line="276" w:lineRule="auto"/>
+              <w:spacing w:before="0" w:after="0" w:line="480" w:lineRule="auto"/>
               <w:ind w:firstLine="0"/>
               <w:jc w:val="center"/>
             </w:pPr>
@@ -6243,7 +6172,7 @@
           </w:tcPr>
           <w:p>
             <w:pPr>
-              <w:spacing w:before="0" w:after="0" w:line="276" w:lineRule="auto"/>
+              <w:spacing w:before="0" w:after="0" w:line="480" w:lineRule="auto"/>
               <w:ind w:firstLine="0"/>
               <w:jc w:val="center"/>
             </w:pPr>
@@ -6276,7 +6205,7 @@
           </w:tcPr>
           <w:p>
             <w:pPr>
-              <w:spacing w:before="0" w:after="0" w:line="276" w:lineRule="auto"/>
+              <w:spacing w:before="0" w:after="0" w:line="480" w:lineRule="auto"/>
               <w:ind w:firstLine="0"/>
               <w:jc w:val="center"/>
             </w:pPr>
@@ -6307,7 +6236,7 @@
           </w:tcPr>
           <w:p>
             <w:pPr>
-              <w:spacing w:before="0" w:after="0" w:line="276" w:lineRule="auto"/>
+              <w:spacing w:before="0" w:after="0" w:line="480" w:lineRule="auto"/>
               <w:ind w:firstLine="0"/>
               <w:jc w:val="center"/>
             </w:pPr>
@@ -6338,7 +6267,7 @@
           </w:tcPr>
           <w:p>
             <w:pPr>
-              <w:spacing w:before="0" w:after="0" w:line="276" w:lineRule="auto"/>
+              <w:spacing w:before="0" w:after="0" w:line="480" w:lineRule="auto"/>
               <w:ind w:firstLine="0"/>
               <w:jc w:val="center"/>
             </w:pPr>
@@ -6369,7 +6298,7 @@
           </w:tcPr>
           <w:p>
             <w:pPr>
-              <w:spacing w:before="0" w:after="0" w:line="276" w:lineRule="auto"/>
+              <w:spacing w:before="0" w:after="0" w:line="480" w:lineRule="auto"/>
               <w:ind w:firstLine="0"/>
               <w:jc w:val="center"/>
             </w:pPr>
@@ -6402,7 +6331,7 @@
           </w:tcPr>
           <w:p>
             <w:pPr>
-              <w:spacing w:before="0" w:after="0" w:line="276" w:lineRule="auto"/>
+              <w:spacing w:before="0" w:after="0" w:line="480" w:lineRule="auto"/>
               <w:ind w:firstLine="0"/>
               <w:jc w:val="center"/>
             </w:pPr>
@@ -6433,7 +6362,7 @@
           </w:tcPr>
           <w:p>
             <w:pPr>
-              <w:spacing w:before="0" w:after="0" w:line="276" w:lineRule="auto"/>
+              <w:spacing w:before="0" w:after="0" w:line="480" w:lineRule="auto"/>
               <w:ind w:firstLine="0"/>
               <w:jc w:val="center"/>
             </w:pPr>
@@ -6464,7 +6393,7 @@
           </w:tcPr>
           <w:p>
             <w:pPr>
-              <w:spacing w:before="0" w:after="0" w:line="276" w:lineRule="auto"/>
+              <w:spacing w:before="0" w:after="0" w:line="480" w:lineRule="auto"/>
               <w:ind w:firstLine="0"/>
               <w:jc w:val="center"/>
             </w:pPr>
@@ -6495,7 +6424,7 @@
           </w:tcPr>
           <w:p>
             <w:pPr>
-              <w:spacing w:before="0" w:after="0" w:line="276" w:lineRule="auto"/>
+              <w:spacing w:before="0" w:after="0" w:line="480" w:lineRule="auto"/>
               <w:ind w:firstLine="0"/>
               <w:jc w:val="center"/>
             </w:pPr>
@@ -6528,7 +6457,7 @@
           </w:tcPr>
           <w:p>
             <w:pPr>
-              <w:spacing w:before="0" w:after="0" w:line="276" w:lineRule="auto"/>
+              <w:spacing w:before="0" w:after="0" w:line="480" w:lineRule="auto"/>
               <w:ind w:firstLine="0"/>
               <w:jc w:val="center"/>
             </w:pPr>
@@ -6559,7 +6488,7 @@
           </w:tcPr>
           <w:p>
             <w:pPr>
-              <w:spacing w:before="0" w:after="0" w:line="276" w:lineRule="auto"/>
+              <w:spacing w:before="0" w:after="0" w:line="480" w:lineRule="auto"/>
               <w:ind w:firstLine="0"/>
               <w:jc w:val="center"/>
             </w:pPr>
@@ -6590,7 +6519,7 @@
           </w:tcPr>
           <w:p>
             <w:pPr>
-              <w:spacing w:before="0" w:after="0" w:line="276" w:lineRule="auto"/>
+              <w:spacing w:before="0" w:after="0" w:line="480" w:lineRule="auto"/>
               <w:ind w:firstLine="0"/>
               <w:jc w:val="center"/>
             </w:pPr>
@@ -6621,7 +6550,7 @@
           </w:tcPr>
           <w:p>
             <w:pPr>
-              <w:spacing w:before="0" w:after="0" w:line="276" w:lineRule="auto"/>
+              <w:spacing w:before="0" w:after="0" w:line="480" w:lineRule="auto"/>
               <w:ind w:firstLine="0"/>
               <w:jc w:val="center"/>
             </w:pPr>
@@ -6654,7 +6583,7 @@
           </w:tcPr>
           <w:p>
             <w:pPr>
-              <w:spacing w:before="0" w:after="0" w:line="276" w:lineRule="auto"/>
+              <w:spacing w:before="0" w:after="0" w:line="480" w:lineRule="auto"/>
               <w:ind w:firstLine="0"/>
               <w:jc w:val="center"/>
             </w:pPr>
@@ -6685,7 +6614,7 @@
           </w:tcPr>
           <w:p>
             <w:pPr>
-              <w:spacing w:before="0" w:after="0" w:line="276" w:lineRule="auto"/>
+              <w:spacing w:before="0" w:after="0" w:line="480" w:lineRule="auto"/>
               <w:ind w:firstLine="0"/>
               <w:jc w:val="center"/>
             </w:pPr>
@@ -6716,7 +6645,7 @@
           </w:tcPr>
           <w:p>
             <w:pPr>
-              <w:spacing w:before="0" w:after="0" w:line="276" w:lineRule="auto"/>
+              <w:spacing w:before="0" w:after="0" w:line="480" w:lineRule="auto"/>
               <w:ind w:firstLine="0"/>
               <w:jc w:val="center"/>
             </w:pPr>
@@ -6747,7 +6676,7 @@
           </w:tcPr>
           <w:p>
             <w:pPr>
-              <w:spacing w:before="0" w:after="0" w:line="276" w:lineRule="auto"/>
+              <w:spacing w:before="0" w:after="0" w:line="480" w:lineRule="auto"/>
               <w:ind w:firstLine="0"/>
               <w:jc w:val="center"/>
             </w:pPr>
@@ -6779,7 +6708,7 @@
           <w:color w:val="000000"/>
           <w:sz w:val="22"/>
         </w:rPr>
-        <w:t>Note: *** p&lt;0.01, ** p&lt;0.05, * p&lt;0.1. High/low trade intensity is split by the median trade-to-GDP ratio across country-year observations. Developed/developing split uses OECD membership; the pre/post-2008 split follows the global financial crisis.</w:t>
+        <w:t>Note: *** p&lt;0.01, ** p&lt;0.05, * p&lt;0.1. High/low trade intensity is split by the median trade-to-GDP ratio. Developed/developing uses OECD membership; pre/post-2008 follows the global financial crisis. Data source: World Bank World Development Indicators (2024).</w:t>
       </w:r>
     </w:p>
     <w:p>
@@ -6827,7 +6756,7 @@
           </w:tcPr>
           <w:p>
             <w:pPr>
-              <w:spacing w:before="0" w:after="0" w:line="276" w:lineRule="auto"/>
+              <w:spacing w:before="0" w:after="0" w:line="480" w:lineRule="auto"/>
               <w:ind w:firstLine="0"/>
               <w:jc w:val="center"/>
             </w:pPr>
@@ -6858,7 +6787,7 @@
           </w:tcPr>
           <w:p>
             <w:pPr>
-              <w:spacing w:before="0" w:after="0" w:line="276" w:lineRule="auto"/>
+              <w:spacing w:before="0" w:after="0" w:line="480" w:lineRule="auto"/>
               <w:ind w:firstLine="0"/>
               <w:jc w:val="center"/>
             </w:pPr>
@@ -6889,7 +6818,7 @@
           </w:tcPr>
           <w:p>
             <w:pPr>
-              <w:spacing w:before="0" w:after="0" w:line="276" w:lineRule="auto"/>
+              <w:spacing w:before="0" w:after="0" w:line="480" w:lineRule="auto"/>
               <w:ind w:firstLine="0"/>
               <w:jc w:val="center"/>
             </w:pPr>
@@ -6920,7 +6849,7 @@
           </w:tcPr>
           <w:p>
             <w:pPr>
-              <w:spacing w:before="0" w:after="0" w:line="276" w:lineRule="auto"/>
+              <w:spacing w:before="0" w:after="0" w:line="480" w:lineRule="auto"/>
               <w:ind w:firstLine="0"/>
               <w:jc w:val="center"/>
             </w:pPr>
@@ -6953,7 +6882,7 @@
           </w:tcPr>
           <w:p>
             <w:pPr>
-              <w:spacing w:before="0" w:after="0" w:line="276" w:lineRule="auto"/>
+              <w:spacing w:before="0" w:after="0" w:line="480" w:lineRule="auto"/>
               <w:ind w:firstLine="0"/>
               <w:jc w:val="center"/>
             </w:pPr>
@@ -6984,7 +6913,7 @@
           </w:tcPr>
           <w:p>
             <w:pPr>
-              <w:spacing w:before="0" w:after="0" w:line="276" w:lineRule="auto"/>
+              <w:spacing w:before="0" w:after="0" w:line="480" w:lineRule="auto"/>
               <w:ind w:firstLine="0"/>
               <w:jc w:val="center"/>
             </w:pPr>
@@ -7015,7 +6944,7 @@
           </w:tcPr>
           <w:p>
             <w:pPr>
-              <w:spacing w:before="0" w:after="0" w:line="276" w:lineRule="auto"/>
+              <w:spacing w:before="0" w:after="0" w:line="480" w:lineRule="auto"/>
               <w:ind w:firstLine="0"/>
               <w:jc w:val="center"/>
             </w:pPr>
@@ -7046,7 +6975,7 @@
           </w:tcPr>
           <w:p>
             <w:pPr>
-              <w:spacing w:before="0" w:after="0" w:line="276" w:lineRule="auto"/>
+              <w:spacing w:before="0" w:after="0" w:line="480" w:lineRule="auto"/>
               <w:ind w:firstLine="0"/>
               <w:jc w:val="center"/>
             </w:pPr>
@@ -7079,7 +7008,7 @@
           </w:tcPr>
           <w:p>
             <w:pPr>
-              <w:spacing w:before="0" w:after="0" w:line="276" w:lineRule="auto"/>
+              <w:spacing w:before="0" w:after="0" w:line="480" w:lineRule="auto"/>
               <w:ind w:firstLine="0"/>
               <w:jc w:val="center"/>
             </w:pPr>
@@ -7110,7 +7039,7 @@
           </w:tcPr>
           <w:p>
             <w:pPr>
-              <w:spacing w:before="0" w:after="0" w:line="276" w:lineRule="auto"/>
+              <w:spacing w:before="0" w:after="0" w:line="480" w:lineRule="auto"/>
               <w:ind w:firstLine="0"/>
               <w:jc w:val="center"/>
             </w:pPr>
@@ -7141,7 +7070,7 @@
           </w:tcPr>
           <w:p>
             <w:pPr>
-              <w:spacing w:before="0" w:after="0" w:line="276" w:lineRule="auto"/>
+              <w:spacing w:before="0" w:after="0" w:line="480" w:lineRule="auto"/>
               <w:ind w:firstLine="0"/>
               <w:jc w:val="center"/>
             </w:pPr>
@@ -7172,7 +7101,7 @@
           </w:tcPr>
           <w:p>
             <w:pPr>
-              <w:spacing w:before="0" w:after="0" w:line="276" w:lineRule="auto"/>
+              <w:spacing w:before="0" w:after="0" w:line="480" w:lineRule="auto"/>
               <w:ind w:firstLine="0"/>
               <w:jc w:val="center"/>
             </w:pPr>
@@ -7205,7 +7134,7 @@
           </w:tcPr>
           <w:p>
             <w:pPr>
-              <w:spacing w:before="0" w:after="0" w:line="276" w:lineRule="auto"/>
+              <w:spacing w:before="0" w:after="0" w:line="480" w:lineRule="auto"/>
               <w:ind w:firstLine="0"/>
               <w:jc w:val="center"/>
             </w:pPr>
@@ -7236,7 +7165,7 @@
           </w:tcPr>
           <w:p>
             <w:pPr>
-              <w:spacing w:before="0" w:after="0" w:line="276" w:lineRule="auto"/>
+              <w:spacing w:before="0" w:after="0" w:line="480" w:lineRule="auto"/>
               <w:ind w:firstLine="0"/>
               <w:jc w:val="center"/>
             </w:pPr>
@@ -7267,7 +7196,7 @@
           </w:tcPr>
           <w:p>
             <w:pPr>
-              <w:spacing w:before="0" w:after="0" w:line="276" w:lineRule="auto"/>
+              <w:spacing w:before="0" w:after="0" w:line="480" w:lineRule="auto"/>
               <w:ind w:firstLine="0"/>
               <w:jc w:val="center"/>
             </w:pPr>
@@ -7298,7 +7227,7 @@
           </w:tcPr>
           <w:p>
             <w:pPr>
-              <w:spacing w:before="0" w:after="0" w:line="276" w:lineRule="auto"/>
+              <w:spacing w:before="0" w:after="0" w:line="480" w:lineRule="auto"/>
               <w:ind w:firstLine="0"/>
               <w:jc w:val="center"/>
             </w:pPr>
@@ -7331,7 +7260,7 @@
           </w:tcPr>
           <w:p>
             <w:pPr>
-              <w:spacing w:before="0" w:after="0" w:line="276" w:lineRule="auto"/>
+              <w:spacing w:before="0" w:after="0" w:line="480" w:lineRule="auto"/>
               <w:ind w:firstLine="0"/>
               <w:jc w:val="center"/>
             </w:pPr>
@@ -7362,7 +7291,7 @@
           </w:tcPr>
           <w:p>
             <w:pPr>
-              <w:spacing w:before="0" w:after="0" w:line="276" w:lineRule="auto"/>
+              <w:spacing w:before="0" w:after="0" w:line="480" w:lineRule="auto"/>
               <w:ind w:firstLine="0"/>
               <w:jc w:val="center"/>
             </w:pPr>
@@ -7393,7 +7322,7 @@
           </w:tcPr>
           <w:p>
             <w:pPr>
-              <w:spacing w:before="0" w:after="0" w:line="276" w:lineRule="auto"/>
+              <w:spacing w:before="0" w:after="0" w:line="480" w:lineRule="auto"/>
               <w:ind w:firstLine="0"/>
               <w:jc w:val="center"/>
             </w:pPr>
@@ -7424,7 +7353,7 @@
           </w:tcPr>
           <w:p>
             <w:pPr>
-              <w:spacing w:before="0" w:after="0" w:line="276" w:lineRule="auto"/>
+              <w:spacing w:before="0" w:after="0" w:line="480" w:lineRule="auto"/>
               <w:ind w:firstLine="0"/>
               <w:jc w:val="center"/>
             </w:pPr>
@@ -7457,7 +7386,7 @@
           </w:tcPr>
           <w:p>
             <w:pPr>
-              <w:spacing w:before="0" w:after="0" w:line="276" w:lineRule="auto"/>
+              <w:spacing w:before="0" w:after="0" w:line="480" w:lineRule="auto"/>
               <w:ind w:firstLine="0"/>
               <w:jc w:val="center"/>
             </w:pPr>
@@ -7488,7 +7417,7 @@
           </w:tcPr>
           <w:p>
             <w:pPr>
-              <w:spacing w:before="0" w:after="0" w:line="276" w:lineRule="auto"/>
+              <w:spacing w:before="0" w:after="0" w:line="480" w:lineRule="auto"/>
               <w:ind w:firstLine="0"/>
               <w:jc w:val="center"/>
             </w:pPr>
@@ -7519,7 +7448,7 @@
           </w:tcPr>
           <w:p>
             <w:pPr>
-              <w:spacing w:before="0" w:after="0" w:line="276" w:lineRule="auto"/>
+              <w:spacing w:before="0" w:after="0" w:line="480" w:lineRule="auto"/>
               <w:ind w:firstLine="0"/>
               <w:jc w:val="center"/>
             </w:pPr>
@@ -7550,7 +7479,7 @@
           </w:tcPr>
           <w:p>
             <w:pPr>
-              <w:spacing w:before="0" w:after="0" w:line="276" w:lineRule="auto"/>
+              <w:spacing w:before="0" w:after="0" w:line="480" w:lineRule="auto"/>
               <w:ind w:firstLine="0"/>
               <w:jc w:val="center"/>
             </w:pPr>
@@ -7583,7 +7512,7 @@
           </w:tcPr>
           <w:p>
             <w:pPr>
-              <w:spacing w:before="0" w:after="0" w:line="276" w:lineRule="auto"/>
+              <w:spacing w:before="0" w:after="0" w:line="480" w:lineRule="auto"/>
               <w:ind w:firstLine="0"/>
               <w:jc w:val="center"/>
             </w:pPr>
@@ -7614,7 +7543,7 @@
           </w:tcPr>
           <w:p>
             <w:pPr>
-              <w:spacing w:before="0" w:after="0" w:line="276" w:lineRule="auto"/>
+              <w:spacing w:before="0" w:after="0" w:line="480" w:lineRule="auto"/>
               <w:ind w:firstLine="0"/>
               <w:jc w:val="center"/>
             </w:pPr>
@@ -7645,7 +7574,7 @@
           </w:tcPr>
           <w:p>
             <w:pPr>
-              <w:spacing w:before="0" w:after="0" w:line="276" w:lineRule="auto"/>
+              <w:spacing w:before="0" w:after="0" w:line="480" w:lineRule="auto"/>
               <w:ind w:firstLine="0"/>
               <w:jc w:val="center"/>
             </w:pPr>
@@ -7676,7 +7605,7 @@
           </w:tcPr>
           <w:p>
             <w:pPr>
-              <w:spacing w:before="0" w:after="0" w:line="276" w:lineRule="auto"/>
+              <w:spacing w:before="0" w:after="0" w:line="480" w:lineRule="auto"/>
               <w:ind w:firstLine="0"/>
               <w:jc w:val="center"/>
             </w:pPr>
@@ -7708,7 +7637,7 @@
           <w:color w:val="000000"/>
           <w:sz w:val="22"/>
         </w:rPr>
-        <w:t>Note: *** p&lt;0.01, ** p&lt;0.05, * p&lt;0.1. Excl. high trade drops countries whose mean trade share exceeds 150% of GDP. Lagged trade uses one-year-lagged log trade openness. First differences uses annual changes in all variables and drops the time effects because they are differenced out.</w:t>
+        <w:t>Note: *** p&lt;0.01, ** p&lt;0.05, * p&lt;0.1. Excl. high trade drops countries with mean trade share above 150% of GDP. Lagged trade uses one-year-lagged log trade openness. First differences uses annual changes. Data source: World Bank World Development Indicators (2024).</w:t>
       </w:r>
     </w:p>
     <w:p>
@@ -7754,7 +7683,7 @@
           </w:tcPr>
           <w:p>
             <w:pPr>
-              <w:spacing w:before="0" w:after="0" w:line="276" w:lineRule="auto"/>
+              <w:spacing w:before="0" w:after="0" w:line="480" w:lineRule="auto"/>
               <w:ind w:firstLine="0"/>
               <w:jc w:val="center"/>
             </w:pPr>
@@ -7785,7 +7714,7 @@
           </w:tcPr>
           <w:p>
             <w:pPr>
-              <w:spacing w:before="0" w:after="0" w:line="276" w:lineRule="auto"/>
+              <w:spacing w:before="0" w:after="0" w:line="480" w:lineRule="auto"/>
               <w:ind w:firstLine="0"/>
               <w:jc w:val="center"/>
             </w:pPr>
@@ -7818,7 +7747,7 @@
           </w:tcPr>
           <w:p>
             <w:pPr>
-              <w:spacing w:before="0" w:after="0" w:line="276" w:lineRule="auto"/>
+              <w:spacing w:before="0" w:after="0" w:line="480" w:lineRule="auto"/>
               <w:ind w:firstLine="0"/>
               <w:jc w:val="center"/>
             </w:pPr>
@@ -7849,7 +7778,7 @@
           </w:tcPr>
           <w:p>
             <w:pPr>
-              <w:spacing w:before="0" w:after="0" w:line="276" w:lineRule="auto"/>
+              <w:spacing w:before="0" w:after="0" w:line="480" w:lineRule="auto"/>
               <w:ind w:firstLine="0"/>
               <w:jc w:val="center"/>
             </w:pPr>
@@ -7882,7 +7811,7 @@
           </w:tcPr>
           <w:p>
             <w:pPr>
-              <w:spacing w:before="0" w:after="0" w:line="276" w:lineRule="auto"/>
+              <w:spacing w:before="0" w:after="0" w:line="480" w:lineRule="auto"/>
               <w:ind w:firstLine="0"/>
               <w:jc w:val="center"/>
             </w:pPr>
@@ -7913,7 +7842,7 @@
           </w:tcPr>
           <w:p>
             <w:pPr>
-              <w:spacing w:before="0" w:after="0" w:line="276" w:lineRule="auto"/>
+              <w:spacing w:before="0" w:after="0" w:line="480" w:lineRule="auto"/>
               <w:ind w:firstLine="0"/>
               <w:jc w:val="center"/>
             </w:pPr>
@@ -7946,7 +7875,7 @@
           </w:tcPr>
           <w:p>
             <w:pPr>
-              <w:spacing w:before="0" w:after="0" w:line="276" w:lineRule="auto"/>
+              <w:spacing w:before="0" w:after="0" w:line="480" w:lineRule="auto"/>
               <w:ind w:firstLine="0"/>
               <w:jc w:val="center"/>
             </w:pPr>
@@ -7977,7 +7906,7 @@
           </w:tcPr>
           <w:p>
             <w:pPr>
-              <w:spacing w:before="0" w:after="0" w:line="276" w:lineRule="auto"/>
+              <w:spacing w:before="0" w:after="0" w:line="480" w:lineRule="auto"/>
               <w:ind w:firstLine="0"/>
               <w:jc w:val="center"/>
             </w:pPr>
@@ -8010,7 +7939,7 @@
           </w:tcPr>
           <w:p>
             <w:pPr>
-              <w:spacing w:before="0" w:after="0" w:line="276" w:lineRule="auto"/>
+              <w:spacing w:before="0" w:after="0" w:line="480" w:lineRule="auto"/>
               <w:ind w:firstLine="0"/>
               <w:jc w:val="center"/>
             </w:pPr>
@@ -8041,7 +7970,7 @@
           </w:tcPr>
           <w:p>
             <w:pPr>
-              <w:spacing w:before="0" w:after="0" w:line="276" w:lineRule="auto"/>
+              <w:spacing w:before="0" w:after="0" w:line="480" w:lineRule="auto"/>
               <w:ind w:firstLine="0"/>
               <w:jc w:val="center"/>
             </w:pPr>
@@ -8074,7 +8003,7 @@
           </w:tcPr>
           <w:p>
             <w:pPr>
-              <w:spacing w:before="0" w:after="0" w:line="276" w:lineRule="auto"/>
+              <w:spacing w:before="0" w:after="0" w:line="480" w:lineRule="auto"/>
               <w:ind w:firstLine="0"/>
               <w:jc w:val="center"/>
             </w:pPr>
@@ -8105,7 +8034,7 @@
           </w:tcPr>
           <w:p>
             <w:pPr>
-              <w:spacing w:before="0" w:after="0" w:line="276" w:lineRule="auto"/>
+              <w:spacing w:before="0" w:after="0" w:line="480" w:lineRule="auto"/>
               <w:ind w:firstLine="0"/>
               <w:jc w:val="center"/>
             </w:pPr>
@@ -8138,7 +8067,7 @@
           </w:tcPr>
           <w:p>
             <w:pPr>
-              <w:spacing w:before="0" w:after="0" w:line="276" w:lineRule="auto"/>
+              <w:spacing w:before="0" w:after="0" w:line="480" w:lineRule="auto"/>
               <w:ind w:firstLine="0"/>
               <w:jc w:val="center"/>
             </w:pPr>
@@ -8169,7 +8098,7 @@
           </w:tcPr>
           <w:p>
             <w:pPr>
-              <w:spacing w:before="0" w:after="0" w:line="276" w:lineRule="auto"/>
+              <w:spacing w:before="0" w:after="0" w:line="480" w:lineRule="auto"/>
               <w:ind w:firstLine="0"/>
               <w:jc w:val="center"/>
             </w:pPr>
@@ -8202,7 +8131,7 @@
           </w:tcPr>
           <w:p>
             <w:pPr>
-              <w:spacing w:before="0" w:after="0" w:line="276" w:lineRule="auto"/>
+              <w:spacing w:before="0" w:after="0" w:line="480" w:lineRule="auto"/>
               <w:ind w:firstLine="0"/>
               <w:jc w:val="center"/>
             </w:pPr>
@@ -8233,7 +8162,7 @@
           </w:tcPr>
           <w:p>
             <w:pPr>
-              <w:spacing w:before="0" w:after="0" w:line="276" w:lineRule="auto"/>
+              <w:spacing w:before="0" w:after="0" w:line="480" w:lineRule="auto"/>
               <w:ind w:firstLine="0"/>
               <w:jc w:val="center"/>
             </w:pPr>
@@ -8265,17 +8194,37 @@
           <w:color w:val="000000"/>
           <w:sz w:val="22"/>
         </w:rPr>
-        <w:t>Note: *** p&lt;0.01, ** p&lt;0.05, * p&lt;0.1. Country and year fixed effects included. The lagged dependent variable is expected to absorb much of the persistence in GDP per capita; the remaining trade coefficient should be interpreted as a short-run association rather than a long-run elasticity.</w:t>
+        <w:t>Note: *** p&lt;0.01, ** p&lt;0.05, * p&lt;0.1. Country and year fixed effects included. The lagged dependent variable absorbs persistence in GDP per capita; the trade coefficient is a short-run association. Data source: World Bank World Development Indicators (2024).</w:t>
       </w:r>
     </w:p>
     <w:sectPr>
+      <w:footerReference w:type="default" r:id="rId9"/>
       <w:pgSz w:w="12240" w:h="15840"/>
       <w:pgMar w:top="1440" w:right="1440" w:bottom="1440" w:left="1440" w:header="720" w:footer="720" w:gutter="0"/>
       <w:cols w:space="720"/>
       <w:docGrid w:linePitch="360"/>
+      <w:lnNumType w:start="1" w:countBy="1" w:restart="continuous"/>
     </w:sectPr>
   </w:body>
 </w:document>
+</file>
+
+<file path=word/footer1.xml><?xml version="1.0" encoding="utf-8"?>
+<w:ftr xmlns:m="http://schemas.openxmlformats.org/officeDocument/2006/math" xmlns:mc="http://schemas.openxmlformats.org/markup-compatibility/2006" xmlns:mo="http://schemas.microsoft.com/office/mac/office/2008/main" xmlns:mv="urn:schemas-microsoft-com:mac:vml" xmlns:o="urn:schemas-microsoft-com:office:office" xmlns:r="http://schemas.openxmlformats.org/officeDocument/2006/relationships" xmlns:v="urn:schemas-microsoft-com:vml" xmlns:w10="urn:schemas-microsoft-com:office:word" xmlns:w14="http://schemas.microsoft.com/office/word/2010/wordml" xmlns:w="http://schemas.openxmlformats.org/wordprocessingml/2006/main" xmlns:wne="http://schemas.microsoft.com/office/word/2006/wordml" xmlns:wp14="http://schemas.microsoft.com/office/word/2010/wordprocessingDrawing" xmlns:wp="http://schemas.openxmlformats.org/drawingml/2006/wordprocessingDrawing" xmlns:wpc="http://schemas.microsoft.com/office/word/2010/wordprocessingCanvas" xmlns:wpg="http://schemas.microsoft.com/office/word/2010/wordprocessingGroup" xmlns:wpi="http://schemas.microsoft.com/office/word/2010/wordprocessingInk" xmlns:wps="http://schemas.microsoft.com/office/word/2010/wordprocessingShape" mc:Ignorable="w14 wp14">
+  <w:p>
+    <w:pPr>
+      <w:pStyle w:val="Footer"/>
+      <w:spacing w:before="0" w:after="0" w:line="480" w:lineRule="auto"/>
+      <w:ind w:firstLine="0"/>
+      <w:jc w:val="center"/>
+    </w:pPr>
+    <w:r>
+      <w:fldChar w:fldCharType="begin"/>
+      <w:instrText xml:space="preserve">PAGE</w:instrText>
+      <w:fldChar w:fldCharType="end"/>
+    </w:r>
+  </w:p>
+</w:ftr>
 </file>
 
 <file path=word/numbering.xml><?xml version="1.0" encoding="utf-8"?>

</xml_diff>